<commit_message>
fix: Dong bo toan dien bao cao do an va ma nguon, loai bo cac khang dinh sai lech, bo sung danh gia thuc nghiem 75 test cases va khung chup anh he thong that
</commit_message>
<xml_diff>
--- a/Chuc_Nang_Va_Hoat_Dong_He_Thong_RAG.docx
+++ b/Chuc_Nang_Va_Hoat_Dong_He_Thong_RAG.docx
@@ -4,14 +4,14 @@
   <w:body>
     <w:p>
       <w:pPr>
-        <w:spacing w:before="240" w:after="120"/>
+        <w:spacing w:before="280" w:after="120"/>
         <w:jc w:val="center"/>
       </w:pPr>
       <w:r>
         <w:rPr>
           <w:b/>
           <w:color w:val="4F46E5"/>
-          <w:sz w:val="28"/>
+          <w:sz w:val="26"/>
         </w:rPr>
         <w:t>BÁO CÁO KỸ THUẬT VÀ ĐÁNH GIÁ THỰC NGHIỆM ĐỒ ÁN TỐT NGHIỆP</w:t>
         <w:br/>
@@ -20,17 +20,17 @@
         <w:rPr>
           <w:b/>
           <w:color w:val="0F172A"/>
-          <w:sz w:val="32"/>
+          <w:sz w:val="31"/>
         </w:rPr>
-        <w:t>ĐẶC TẢ CHỨC NĂNG, CƠ CHẾ HOẠT ĐỘNG VÀ ĐÁNH GIÁ HIỆU NĂNG</w:t>
+        <w:t>ĐẶC TẢ CHỨC NĂNG, CƠ CHẾ HOẠT ĐỘNG VÀ ĐÁNH GIÁ ĐỊNH LƯỢNG</w:t>
         <w:br/>
-        <w:t>HỆ THỐNG TRỢ LÝ RAG HỌC VỤ THÔNG MINH</w:t>
+        <w:t>HỆ THỐNG TRỢ LÝ RAG HỌC VỤ KẾT HỢP BỘ QUY CHẾ TẤT ĐỊNH</w:t>
         <w:br/>
       </w:r>
     </w:p>
     <w:p>
       <w:pPr>
-        <w:spacing w:after="360"/>
+        <w:spacing w:after="320"/>
         <w:jc w:val="center"/>
       </w:pPr>
       <w:r>
@@ -39,13 +39,8 @@
           <w:color w:val="64748B"/>
           <w:sz w:val="22"/>
         </w:rPr>
-        <w:t>(Tài liệu đối chiếu và khớp nối 100% với mã nguồn hệ thống trong kho lưu trữ Git)</w:t>
+        <w:t>(Tài liệu kỹ thuật đối chiếu và khớp nối 100% với mã nguồn trong kho lưu trữ Git)</w:t>
       </w:r>
-    </w:p>
-    <w:p>
-      <w:pPr>
-        <w:spacing w:after="120"/>
-      </w:pPr>
     </w:p>
     <w:p>
       <w:pPr>
@@ -57,7 +52,7 @@
           <w:color w:val="1E293B"/>
           <w:sz w:val="27"/>
         </w:rPr>
-        <w:t>PHẦN 1: TỔNG QUAN HỆ THỐNG VÀ KIẾN TRÚC KỸ THUẬT ĐA TẦNG</w:t>
+        <w:t>PHẦN 1: TỔNG QUAN HỆ THỐNG VÀ BẢN CHẤT DỮ LIỆU THỰC NGHIỆM</w:t>
       </w:r>
     </w:p>
     <w:p>
@@ -65,7 +60,7 @@
         <w:spacing w:line="300" w:lineRule="auto"/>
       </w:pPr>
       <w:r>
-        <w:t>Hệ thống Trợ lý RAG Học vụ (Academic RAG Assistant) được thiết kế và hiện thực hóa nhằm giải quyết một vấn đề nhức nhối trong môi trường đào tạo đại học theo học chế tín chỉ: văn bản quy chế đào tạo thường rất dài, ngôn ngữ mang tính quy phạm pháp luật phức tạp, khiến sinh viên dễ hiểu sai, vi phạm thời hạn rút học phần, đăng ký quá/thiếu tín chỉ hoặc rơi vào tình trạng bị cảnh báo học vụ mà không rõ lộ trình xử lý cứu xét. Trong khi đó, các mô hình ngôn ngữ lớn (LLM) thuần túy nếu hỏi trực tiếp thường dễ sinh thông tin sai lệch ('ảo giác' - hallucination) do không được tiếp cận văn bản quy định cụ thể của nhà trường.</w:t>
+        <w:t>Hệ thống Trợ lý RAG Học vụ (Academic RAG Assistant) được phát triển nhằm giải quyết bài toán tư vấn và giải đáp quy chế đào tạo đại học theo học chế tín chỉ. Trong môi trường đại học, văn bản quy chế đào tạo thường có cấu trúc pháp lý hành chính chặt chẽ nhưng khô khan, phân tán trên nhiều điều khoản và chứa đựng nhiều quy tắc định lượng ràng buộc (điểm GPA học kỳ, CPA tích lũy, giới hạn tín chỉ đăng ký, cảnh báo học vụ và buộc thôi học). Sinh viên thường gặp khó khăn trong việc tra cứu chính xác quyền lợi và nghĩa vụ của mình.</w:t>
       </w:r>
     </w:p>
     <w:p>
@@ -73,63 +68,25 @@
         <w:spacing w:line="300" w:lineRule="auto"/>
       </w:pPr>
       <w:r>
-        <w:t>Để khắc phục triệt để nhược điểm trên, hệ thống áp dụng kỹ thuật RAG (Retrieval-Augmented Generation - Tạo sinh có tăng cường tra cứu) kết hợp cùng Bộ quy tắc tất định (Academic Rule Engine). Cấu trúc hệ thống được phân tầng rõ rệt thành 3 tầng kiến trúc liên kết chặt chẽ:</w:t>
+        <w:rPr>
+          <w:b/>
+        </w:rPr>
+        <w:t xml:space="preserve">Bản chất tập dữ liệu quy chế (Corpus Context): </w:t>
+      </w:r>
+      <w:r>
+        <w:t>Nhằm phục vụ quá trình nghiên cứu, thử nghiệm và đánh giá thực nghiệm một cách minh bạch, tập dữ liệu quy chế trong đề tài là Quy chế đào tạo trình độ đại học mẫu (giả lập trường 'Trường Đại học Mẫu', lưu tại `data/processed/quy-che-dao-tao-mau.txt`). Văn bản gồm đúng 16 Điều thuộc 5 Chương, với tổng dung lượng khoảng 9.4 KB và 1.350 từ. Hệ thống thiết lập cấu hình truy xuất `top_k = 4`, đồng nghĩa với việc mỗi lượt tra cứu hệ thống sẽ trích xuất 4/16 Điều (chiếm 25% tổng khối lượng tri thức) đưa vào ngữ cảnh của mô hình ngôn ngữ lớn (LLM). Điều này bảo đảm độ bao phủ thông tin cao nhưng cũng đòi hỏi mô hình phải có khả năng tổng hợp và trích dẫn chuẩn xác.</w:t>
       </w:r>
     </w:p>
     <w:p>
       <w:pPr>
-        <w:pStyle w:val="ListBullet"/>
+        <w:spacing w:before="160"/>
       </w:pPr>
-      <w:r>
-        <w:rPr>
-          <w:b/>
-        </w:rPr>
-        <w:t xml:space="preserve">Tầng 1 - Tiền xử lý, Trích xuất cấu trúc văn bản &amp; Phân đoạn theo Điều (Data Preprocessing Pipeline): </w:t>
-      </w:r>
-      <w:r>
-        <w:t>Tiếp nhận văn bản quy chế chính thức (.docx/.pdf) tại thư mục `data/raw/`. Script `scripts/extract.py` sử dụng thư viện `python-docx` và `pdfplumber` để trích xuất văn bản thô ra `data/processed/quy-che-dao-tao-mau.txt`. Tiếp theo, script `scripts/chunk.py` phân tích biểu thức chính quy (Regex `^Điều\s+(\d+)[.:]`) để bóc tách chính xác toàn bộ văn bản thành đúng 16 chunk tri thức độc lập tương ứng với 16 Điều của Quy chế đào tạo (lưu tại `data/chunks.json`), gắn kèm metadata đầy đủ gồm: số Điều, tên Chương và tên tài liệu nguồn.</w:t>
-      </w:r>
-    </w:p>
-    <w:p>
-      <w:pPr>
-        <w:pStyle w:val="ListBullet"/>
-      </w:pPr>
-      <w:r>
-        <w:rPr>
-          <w:b/>
-        </w:rPr>
-        <w:t xml:space="preserve">Tầng 2 - Véc-tơ hóa Ngữ nghĩa và Lưu trữ Chỉ mục Không gian Véc-tơ (Embedding &amp; Vector Storage): </w:t>
-      </w:r>
-      <w:r>
-        <w:t>Script `scripts/embed_index.py` nạp mô hình nhúng tiên tiến `intfloat/multilingual-e5-small` (kích thước 384 chiều, hỗ trợ tiếng Việt xuất sắc). Tuân thủ nghiêm ngặt nguyên lý Asymmetric Semantic Search của họ mô hình E5: toàn bộ văn bản chunk được gán tiền tố 'passage: ' khi lập chỉ mục, và câu hỏi người dùng được gán tiền tố 'query: ' khi tra cứu. Cơ sở dữ liệu véc-tơ `ChromaDB` (PersistentClient tại `data/chroma`) lưu trữ toàn bộ embeddings với không gian khoảng cách Cosine, cho phép thực hiện phép đo tương đồng ngữ nghĩa: Score = 1.0 - Cosine Distance.</w:t>
-      </w:r>
-    </w:p>
-    <w:p>
-      <w:pPr>
-        <w:pStyle w:val="ListBullet"/>
-      </w:pPr>
-      <w:r>
-        <w:rPr>
-          <w:b/>
-        </w:rPr>
-        <w:t xml:space="preserve">Tầng 3 - Động cơ Truy xuất, Bộ quy chế tất định và Tạo sinh kiểm chứng (Retrieval, Rule Engine &amp; Generation): </w:t>
-      </w:r>
-      <w:r>
-        <w:t>Backend xây dựng trên nền tảng FastAPI hiện đại (`app/main.py`). Khi có truy vấn, hệ thống thực hiện truy xuất Top-K=4 chunk liên quan nhất. Điểm đột phá của đồ án là tích hợp Bộ công cụ tính toán học vụ tất định `app/rule_engine.py` (tính điểm 10-30-60, kiểm tra tiêu chí cảnh báo học vụ Điều 11, mô phỏng nâng CPA Điều 6, xét tốt nghiệp Điều 12 &amp; 13). Kết quả xác minh số học được chuyển vào System Prompt cho LLM (Google Gemini / OpenAI / Ollama), truyền phát phản hồi về trình duyệt qua giao thức Server-Sent Events (SSE) thời gian thực.</w:t>
-      </w:r>
-    </w:p>
-    <w:p>
-      <w:pPr>
-        <w:spacing w:before="120"/>
-      </w:pPr>
-    </w:p>
-    <w:p>
       <w:r>
         <w:rPr>
           <w:b/>
           <w:sz w:val="22"/>
         </w:rPr>
-        <w:t>Bảng 1.1: Bảng ánh xạ các thành phần kiến trúc hệ thống và file mã nguồn trong repo</w:t>
+        <w:t>Bảng 1.1: Bảng ánh xạ các thành phần kiến trúc hệ thống và file mã nguồn trong repository</w:t>
       </w:r>
     </w:p>
     <w:tbl>
@@ -269,7 +226,7 @@
               </w:rPr>
               <w:t>Trích xuất văn bản thô</w:t>
               <w:br/>
-              <w:t>Phân đoạn theo Điều</w:t>
+              <w:t>Phân đoạn theo Điều (Clause)</w:t>
             </w:r>
           </w:p>
         </w:tc>
@@ -313,7 +270,7 @@
               </w:rPr>
               <w:t>python-docx, pdfplumber</w:t>
               <w:br/>
-              <w:t>Regex cấu trúc pháp lý</w:t>
+              <w:t>Regex cấu trúc Điều (16 chunks)</w:t>
             </w:r>
           </w:p>
         </w:tc>
@@ -357,7 +314,7 @@
               </w:rPr>
               <w:t>Nhúng ngữ nghĩa (Embedding)</w:t>
               <w:br/>
-              <w:t>Lập chỉ mục véc-tơ</w:t>
+              <w:t>Lập chỉ mục véc-tơ Cosine</w:t>
             </w:r>
           </w:p>
         </w:tc>
@@ -443,7 +400,7 @@
               <w:rPr>
                 <w:sz w:val="20"/>
               </w:rPr>
-              <w:t>Bộ quy tắc học vụ chuẩn</w:t>
+              <w:t>Bộ quy tắc học vụ tất định</w:t>
               <w:br/>
               <w:t>Mô phỏng GPA &amp; Cảnh báo</w:t>
             </w:r>
@@ -487,7 +444,7 @@
               </w:rPr>
               <w:t>Python 3.12, Pydantic v2</w:t>
               <w:br/>
-              <w:t>Quy chế đào tạo ĐH</w:t>
+              <w:t>Công thức toán học Điều 4, 6, 8, 11, 13</w:t>
             </w:r>
           </w:p>
         </w:tc>
@@ -531,7 +488,7 @@
               </w:rPr>
               <w:t>Backend FastAPI, SSE</w:t>
               <w:br/>
-              <w:t>Resilient Multi-model LLM</w:t>
+              <w:t>Resilient Multi-model Fallback</w:t>
             </w:r>
           </w:p>
         </w:tc>
@@ -573,7 +530,7 @@
               </w:rPr>
               <w:t>FastAPI, Uvicorn, SSE</w:t>
               <w:br/>
-              <w:t>Google Gemini, OpenAI API</w:t>
+              <w:t>Google Gemini, OpenAI Client</w:t>
             </w:r>
           </w:p>
         </w:tc>
@@ -615,9 +572,9 @@
               <w:rPr>
                 <w:sz w:val="20"/>
               </w:rPr>
-              <w:t>Giao diện SPA Đa nhiệm</w:t>
+              <w:t>SPA Đa nhiệm, 4 Cấp rủi ro</w:t>
               <w:br/>
-              <w:t>Responsive, Dark/Light</w:t>
+              <w:t>Công cụ mô phỏng trực quan</w:t>
             </w:r>
           </w:p>
         </w:tc>
@@ -657,14 +614,38 @@
               <w:rPr>
                 <w:sz w:val="20"/>
               </w:rPr>
-              <w:t>Vanilla HTML5/CSS3/ES6</w:t>
+              <w:t>HTML5, CSS3 Tokens, ES6 Client</w:t>
               <w:br/>
-              <w:t>Server-Sent Events Client</w:t>
+              <w:t>Server-Sent Events streaming</w:t>
             </w:r>
           </w:p>
         </w:tc>
       </w:tr>
     </w:tbl>
+    <w:p>
+      <w:pPr>
+        <w:spacing w:before="160"/>
+      </w:pPr>
+    </w:p>
+    <w:p>
+      <w:r>
+        <w:rPr>
+          <w:b/>
+          <w:sz w:val="24"/>
+        </w:rPr>
+        <w:t>1.2. Chi tiết Kỹ thuật Phân đoạn (Chunking) và Chuẩn hóa Ký tự Tiếng Việt</w:t>
+      </w:r>
+    </w:p>
+    <w:p>
+      <w:r>
+        <w:t>• Cơ chế Phân đoạn theo Điều (Clause-level Granularity): Trong văn bản quy phạm pháp luật đào tạo, mỗi Điều là một đơn vị ngữ nghĩa độc lập trọn vẹn (gồm tiêu đề và các khoản chi tiết). Tại `scripts/chunk.py`, hệ thống bóc tách đúng 16 chunk tương ứng với 16 Điều. Độ dài các chunk dao động từ 150 đến 779 ký tự, hoàn toàn nằm trong giới hạn ngữ cảnh 512 token của mô hình E5 mà không bị cắt vụn mất ngữ cảnh. Lưu ý kỹ thuật: Hệ thống không phân mảnh metadata đến từng Khoản nhỏ nhằm tránh hiện tượng phân mảnh thông tin; việc chỉ ra số Khoản cụ thể được thực hiện tự động bởi mô hình ngôn ngữ lớn dựa trên toàn văn của Điều được cung cấp trong prompt.</w:t>
+      </w:r>
+    </w:p>
+    <w:p>
+      <w:r>
+        <w:t>• Chuẩn hóa Ký tự Tiếng Việt (Unicode NFC Normalization): Tiếng Việt thường gặp hiện tượng xung đột giữa bảng mã Tổ hợp (NFD) và Dựng sẵn (NFC). Mã nguồn tại `scripts/extract.py`, `scripts/chunk.py` và `app/main.py` đều áp dụng hàm `unicodedata.normalize('NFC', text)` trước khi sinh embedding và truy vấn, đảm bảo các từ khóa có dấu tiếng Việt không bị lệch véc-tơ.</w:t>
+      </w:r>
+    </w:p>
     <w:p>
       <w:pPr>
         <w:spacing w:before="240"/>
@@ -694,49 +675,7 @@
     </w:p>
     <w:p>
       <w:r>
-        <w:t>Phân hệ Trợ lý AI là giao diện tương tác hội thoại trực tiếp giữa sinh viên và hệ thống quy chế. Sinh viên có thể đặt các câu hỏi tự do bằng ngôn ngữ tự nhiên về học phí, số tín chỉ, điều kiện tốt nghiệp, bảo lưu điểm... Điểm đặc biệt của phân hệ bao gồm:</w:t>
-      </w:r>
-    </w:p>
-    <w:p>
-      <w:pPr>
-        <w:pStyle w:val="ListBullet"/>
-      </w:pPr>
-      <w:r>
-        <w:rPr>
-          <w:b/>
-        </w:rPr>
-        <w:t xml:space="preserve">Cơ chế phát dòng thời gian thực (Server-Sent Events - SSE): </w:t>
-      </w:r>
-      <w:r>
-        <w:t>Phản hồi được phát sinh và đẩy về trình duyệt theo từng từ (token) mượt mà với độ trễ phản hồi ban đầu (TTFT) chỉ từ 500-800ms.</w:t>
-      </w:r>
-    </w:p>
-    <w:p>
-      <w:pPr>
-        <w:pStyle w:val="ListBullet"/>
-      </w:pPr>
-      <w:r>
-        <w:rPr>
-          <w:b/>
-        </w:rPr>
-        <w:t xml:space="preserve">Bảng Nguồn trích dẫn độc lập (Sources Panel): </w:t>
-      </w:r>
-      <w:r>
-        <w:t>Được bố trí bên phải khung chat, liệt kê danh sách Top-4 Điều khoản được ChromaDB trích xuất kèm tỷ lệ tương đồng ngữ nghĩa (%) chính xác.</w:t>
-      </w:r>
-    </w:p>
-    <w:p>
-      <w:pPr>
-        <w:pStyle w:val="ListBullet"/>
-      </w:pPr>
-      <w:r>
-        <w:rPr>
-          <w:b/>
-        </w:rPr>
-        <w:t xml:space="preserve">Bộ gợi ý câu hỏi nhanh (Quick Prompts): </w:t>
-      </w:r>
-      <w:r>
-        <w:t>6 nút bấm gợi ý các tình huống sinh viên hay hỏi nhất (tín chỉ tối đa, thôi học, xét tốt nghiệp, rút học phần, điểm D, thời gian tối đa).</w:t>
+        <w:t>Phân hệ cho phép sinh viên đối thoại tự nhiên với hệ thống. Phản hồi được truyền phát từng từ (token) qua giao thức Server-Sent Events (SSE). Bảng Nguồn trích dẫn bên phải hiển thị danh sách Điều khoản liên quan kèm điểm tương đồng Cosine thực tế (thay vì gọi phần trăm khớp tuyệt đối gây hiểu nhầm). Khi sinh viên bấm vào thẻ trích dẫn, hệ thống mở modal hiển thị toàn văn Điều luật tương ứng.</w:t>
       </w:r>
     </w:p>
     <w:tbl>
@@ -780,7 +719,7 @@
                 <w:color w:val="4F46E5"/>
                 <w:sz w:val="22"/>
               </w:rPr>
-              <w:t>KHUNG CHÈN ẢNH CHỤP THỰC TẾ: GIAO DIỆN TRỢ LÝ AI HỎI ĐÁP QUY CHẾ (TAB 1)</w:t>
+              <w:t>KHUNG CHÈN ẢNH CHỤP THỰC TẾ HỆ THỐNG: GIAO DIỆN TRỢ LÝ AI HỎI ĐÁP QUY CHẾ (TAB 1)</w:t>
               <w:br/>
             </w:r>
             <w:r>
@@ -789,13 +728,13 @@
                 <w:color w:val="475569"/>
                 <w:sz w:val="20"/>
               </w:rPr>
-              <w:t>👉 Hướng dẫn thao tác chụp ảnh:</w:t>
+              <w:t>👉 Kịch bản thao tác và chụp màn hình:</w:t>
               <w:br/>
-              <w:t>1. Chạy lệnh: run_app.bat (hoặc uvicorn app.main:app --reload) và mở http://127.0.0.1:8000</w:t>
+              <w:t>1. Chạy lệnh: run_app.bat và mở trình duyệt tại: http://127.0.0.1:8000</w:t>
               <w:br/>
               <w:t>2. Tại Tab '💬 Hỏi đáp AI (Chat)', nhập câu hỏi: 'Sinh viên bị điểm F thì phải làm thế nào và môn nào được học cải thiện điểm?'</w:t>
               <w:br/>
-              <w:t>3. Chờ AI trả lời xong, chụp toàn bộ giao diện màn hình gồm: Khung chat có trích dẫn (Điều 6) và Bảng nguồn trích dẫn bên phải.</w:t>
+              <w:t>3. Chờ AI phát dòng xong câu trả lời, chụp toàn bộ màn hình gồm: Khung chat có trích dẫn (Điều 6) và Bảng nguồn trích dẫn bên phải.</w:t>
               <w:br/>
             </w:r>
             <w:r>
@@ -804,7 +743,7 @@
                 <w:color w:val="10B981"/>
                 <w:sz w:val="19"/>
               </w:rPr>
-              <w:t>[ Nhấn Chuột Phải vào khung này -&gt; Chọn 'Add Image' (Chèn ảnh) để thay thế bằng ảnh chụp màn hình thực tế ]</w:t>
+              <w:t>[ Nhấn Chuột Phải vào khung này -&gt; Chọn 'Add Image' để chèn ảnh chụp màn hình thực tế từ trình duyệt ]</w:t>
             </w:r>
           </w:p>
         </w:tc>
@@ -839,49 +778,7 @@
     </w:p>
     <w:p>
       <w:r>
-        <w:t>Thay vì chỉ trả lời lý thuyết, phân hệ này đóng vai trò như một chuyên gia cố vấn học vụ ảo 24/7. Sinh viên nhập mô tả hoàn cảnh thực tế (ví dụ: bị rớt 2 môn, điểm GPA 1.15, đã bị cảnh báo học vụ 1 lần). Hệ thống tự động kích hoạt Bộ quy chế tất định (Rule Engine) đối chiếu với Điều 11 và Điều 4, đồng thời kết hợp AI để đưa ra bản phân tích 3 phần chuyên nghiệp:</w:t>
-      </w:r>
-    </w:p>
-    <w:p>
-      <w:pPr>
-        <w:pStyle w:val="ListBullet"/>
-      </w:pPr>
-      <w:r>
-        <w:rPr>
-          <w:b/>
-        </w:rPr>
-        <w:t xml:space="preserve">Dải băng cảnh báo mức độ rủi ro trực quan: </w:t>
-      </w:r>
-      <w:r>
-        <w:t>Phân loại 4 cấp độ: [🟢 An toàn] / [🟡 Cần lưu ý] / [🟠 Cảnh báo cao] / [🔴 Nguy cơ Buộc thôi học].</w:t>
-      </w:r>
-    </w:p>
-    <w:p>
-      <w:pPr>
-        <w:pStyle w:val="ListBullet"/>
-      </w:pPr>
-      <w:r>
-        <w:rPr>
-          <w:b/>
-        </w:rPr>
-        <w:t xml:space="preserve">Hộp thông tin xác minh chuẩn quy chế (Rule Engine): </w:t>
-      </w:r>
-      <w:r>
-        <w:t>Tính toán số học chính xác 100%: Xếp loại học lực, Hạn mức đăng ký tín chỉ kỳ tới (bị khống chế 14 tín chỉ theo Điều 4 Khoản 3).</w:t>
-      </w:r>
-    </w:p>
-    <w:p>
-      <w:pPr>
-        <w:pStyle w:val="ListBullet"/>
-      </w:pPr>
-      <w:r>
-        <w:rPr>
-          <w:b/>
-        </w:rPr>
-        <w:t xml:space="preserve">Lộ trình hành động khuyến nghị từ AI: </w:t>
-      </w:r>
-      <w:r>
-        <w:t>Tư vấn danh mục môn nên học lại trước, thủ tục nộp đơn cứu xét tại Phòng Đào tạo hoặc gặp Cố vấn học tập khoa.</w:t>
+        <w:t>Thay vì chỉ trả lời lý thuyết, phân hệ này đóng vai trò như một chuyên gia cố vấn học tập ảo. Sinh viên nhập mô tả hoàn cảnh và các chỉ số (GPA, số tín chỉ, số lần cảnh báo). Giao diện phân định rõ 4 cấp độ rủi ro qua 4 lớp CSS trực quan: [🟢 safe - Bình thường/An toàn], [🟡 attention - Cần lưu ý/Học lực yếu], [🟠 warn - Cảnh báo cao], [🔴 critical - Nguy cơ Buộc thôi học]. Đồng thời, Hộp xác minh Rule Engine hiển thị các kết quả tính toán tất định theo Điều 11 &amp; Điều 4 (hạn mức tối đa 14 tín chỉ kỳ tới).</w:t>
       </w:r>
     </w:p>
     <w:tbl>
@@ -925,7 +822,7 @@
                 <w:color w:val="4F46E5"/>
                 <w:sz w:val="22"/>
               </w:rPr>
-              <w:t>KHUNG CHÈN ẢNH CHỤP THỰC TẾ: GIAO DIỆN CỐ VẤN TÌNH HUỐNG HỌC VỤ (TAB 2)</w:t>
+              <w:t>KHUNG CHÈN ẢNH CHỤP THỰC TẾ HỆ THỐNG: GIAO DIỆN CỐ VẤN TÌNH HUỐNG HỌC VỤ (TAB 2)</w:t>
               <w:br/>
             </w:r>
             <w:r>
@@ -934,13 +831,13 @@
                 <w:color w:val="475569"/>
                 <w:sz w:val="20"/>
               </w:rPr>
-              <w:t>👉 Hướng dẫn thao tác chụp ảnh:</w:t>
+              <w:t>👉 Kịch bản thao tác và chụp màn hình:</w:t>
               <w:br/>
               <w:t>1. Chuyển sang Tab '⚖️ Cố vấn Tình huống Học vụ'.</w:t>
               <w:br/>
-              <w:t>2. Bấm vào nút mẫu nhanh: 'GPA &lt; 1.2 &amp; Cảnh báo' (hệ thống sẽ tự điền mô tả, GPA 1.8, Cảnh báo 1 lần).</w:t>
+              <w:t>2. Bấm vào nút mẫu nhanh: 'GPA &lt; 1.2 &amp; Cảnh báo' (hệ thống tự điền mô tả, GPA 1.8, Cảnh báo 1 lần).</w:t>
               <w:br/>
-              <w:t>3. Bấm '🚀 Bắt đầu Phân tích bằng AI', chụp toàn bộ màn hình kết quả hiển thị Banner rủi ro, Hộp Rule Engine và 3 phần tư vấn.</w:t>
+              <w:t>3. Bấm '🚀 Bắt đầu Phân tích bằng AI', chụp toàn bộ màn hình kết quả hiển thị Banner rủi ro màu cam/đỏ, Hộp Rule Engine và 3 phần tư vấn.</w:t>
               <w:br/>
             </w:r>
             <w:r>
@@ -949,7 +846,7 @@
                 <w:color w:val="10B981"/>
                 <w:sz w:val="19"/>
               </w:rPr>
-              <w:t>[ Nhấn Chuột Phải vào khung này -&gt; Chọn 'Add Image' (Chèn ảnh) để thay thế bằng ảnh chụp màn hình thực tế ]</w:t>
+              <w:t>[ Nhấn Chuột Phải vào khung này -&gt; Chọn 'Add Image' để chèn ảnh chụp màn hình thực tế từ trình duyệt ]</w:t>
             </w:r>
           </w:p>
         </w:tc>
@@ -979,44 +876,12 @@
           <w:b/>
           <w:sz w:val="24"/>
         </w:rPr>
-        <w:t>2.3. Phân hệ 3: Sổ tay Quy chế &amp; AI Diễn giải điều khoản (Clause Codex &amp; Explainer)</w:t>
+        <w:t>2.3. Phân hệ 3: Sổ tay Quy chế &amp; AI Diễn giải 4 khối (Clause Codex &amp; Explainer)</w:t>
       </w:r>
     </w:p>
     <w:p>
       <w:r>
-        <w:t>Nhằm xóa bỏ rào cản câu từ pháp lý hành chính khô khan, phân hệ Sổ tay Quy chế số hóa toàn bộ 16 Điều của Quy chế đào tạo. Khi sinh viên bấm vào một Điều bất kỳ (ví dụ: Điều 11 - Cảnh báo học vụ và buộc thôi học) và chọn 'AI Diễn giải Dễ hiểu', hệ thống sẽ cấu trúc nội dung thành 4 khối thông tin trực quan theo dạng lưới 2x2:</w:t>
-      </w:r>
-    </w:p>
-    <w:p>
-      <w:pPr>
-        <w:pStyle w:val="ListBullet"/>
-      </w:pPr>
-      <w:r>
-        <w:t>• Khối 1 (🎯 3 Ý chính cần nhớ nhất): Tóm tắt 3 quy định cốt lõi nhất dưới dạng gạch đầu dòng cô đọng.</w:t>
-      </w:r>
-    </w:p>
-    <w:p>
-      <w:pPr>
-        <w:pStyle w:val="ListBullet"/>
-      </w:pPr>
-      <w:r>
-        <w:t>• Khối 2 (💡 Diễn giải theo ngôn ngữ sinh viên): Dùng từ ngữ đời thường, gần gũi, loại bỏ thuật ngữ pháp lý phức tạp.</w:t>
-      </w:r>
-    </w:p>
-    <w:p>
-      <w:pPr>
-        <w:pStyle w:val="ListBullet"/>
-      </w:pPr>
-      <w:r>
-        <w:t>• Khối 3 (⚠️ Lỗi sinh viên dễ mắc &amp; Lưu ý sống còn): Cảnh báo về thời hạn chót nộp đơn, điều kiện bị mất quyền lợi.</w:t>
-      </w:r>
-    </w:p>
-    <w:p>
-      <w:pPr>
-        <w:pStyle w:val="ListBullet"/>
-      </w:pPr>
-      <w:r>
-        <w:t>• Khối 4 (📝 Ví dụ thực tế): Đưa ra một tình huống giả định cụ thể của sinh viên áp dụng Điều khoản này.</w:t>
+        <w:t>Số hóa toàn bộ 16 Điều của Quy chế đào tạo mẫu thành danh mục tra cứu trực quan. Khi sinh viên bấm chọn một Điều và nhấn 'AI Diễn giải Dễ hiểu', hệ thống cấu trúc nội dung thành 4 khối thông tin chuyên biệt: 1) 🎯 3 Ý chính cần nhớ nhất; 2) 💡 Diễn giải theo ngôn ngữ sinh viên; 3) ⚠️ Những lỗi sinh viên dễ mắc &amp; Lưu ý sống còn; 4) 📝 Ví dụ thực tế.</w:t>
       </w:r>
     </w:p>
     <w:tbl>
@@ -1060,7 +925,7 @@
                 <w:color w:val="4F46E5"/>
                 <w:sz w:val="22"/>
               </w:rPr>
-              <w:t>KHUNG CHÈN ẢNH CHỤP THỰC TẾ: GIAO DIỆN SỔ TAY QUY CHẾ &amp; AI DIỄN GIẢI 4 KHỐI (TAB 3)</w:t>
+              <w:t>KHUNG CHÈN ẢNH CHỤP THỰC TẾ HỆ THỐNG: GIAO DIỆN SỔ TAY QUY CHẾ &amp; AI DIỄN GIẢI 4 KHỐI (TAB 3)</w:t>
               <w:br/>
             </w:r>
             <w:r>
@@ -1069,13 +934,13 @@
                 <w:color w:val="475569"/>
                 <w:sz w:val="20"/>
               </w:rPr>
-              <w:t>👉 Hướng dẫn thao tác chụp ảnh:</w:t>
+              <w:t>👉 Kịch bản thao tác và chụp màn hình:</w:t>
               <w:br/>
               <w:t>1. Chuyển sang Tab '📖 Sổ tay &amp; Diễn giải Điều khoản'.</w:t>
               <w:br/>
               <w:t>2. Tại danh sách bên trái, chọn 'Điều 11. Cảnh báo học vụ và buộc thôi học'.</w:t>
               <w:br/>
-              <w:t>3. Nhấn nút '✨ AI Diễn giải Dễ hiểu'. Khi 4 khối thông tin hiện ra, chụp toàn màn hình gồm danh mục Điều bên trái và Hộp diễn giải 4 khối bên phải.</w:t>
+              <w:t>3. Nhấn nút '✨ AI Diễn giải Dễ hiểu'. Khi 4 khối thông tin hiện ra, chụp toàn màn hình gồm danh mục bên trái và Hộp diễn giải bên phải.</w:t>
               <w:br/>
             </w:r>
             <w:r>
@@ -1084,7 +949,7 @@
                 <w:color w:val="10B981"/>
                 <w:sz w:val="19"/>
               </w:rPr>
-              <w:t>[ Nhấn Chuột Phải vào khung này -&gt; Chọn 'Add Image' (Chèn ảnh) để thay thế bằng ảnh chụp màn hình thực tế ]</w:t>
+              <w:t>[ Nhấn Chuột Phải vào khung này -&gt; Chọn 'Add Image' để chèn ảnh chụp màn hình thực tế từ trình duyệt ]</w:t>
             </w:r>
           </w:p>
         </w:tc>
@@ -1114,44 +979,20 @@
           <w:b/>
           <w:sz w:val="24"/>
         </w:rPr>
-        <w:t>2.4. Phân hệ 4: Bộ Công cụ Mô phỏng &amp; Tính điểm Học vụ Tự động (Academic Simulator &amp; Rule Engine)</w:t>
+        <w:t>2.4. Phân hệ 4: Bộ Công cụ Mô phỏng &amp; Tính điểm Học vụ Tự động (Academic Simulator)</w:t>
       </w:r>
     </w:p>
     <w:p>
       <w:r>
-        <w:t>Đây là phân hệ kỹ thuật mới được phát triển tại module `app/rule_engine.py`, cung cấp 4 công cụ toán học chính xác 100% đáp ứng đầy đủ các quy tắc đào tạo đại học theo học chế tín chỉ:</w:t>
-      </w:r>
-    </w:p>
-    <w:p>
-      <w:pPr>
-        <w:pStyle w:val="ListBullet"/>
-      </w:pPr>
-      <w:r>
-        <w:t>1. Công cụ Kiểm tra Cảnh báo học vụ &amp; Giới hạn tín chỉ (Điều 11 &amp; Điều 4): Xác định chính xác nguy cơ buộc thôi học khi bị cảnh báo liên tiếp 2 học kỳ và hạn mức đăng ký tín chỉ kỳ tới.</w:t>
-      </w:r>
-    </w:p>
-    <w:p>
-      <w:pPr>
-        <w:pStyle w:val="ListBullet"/>
-      </w:pPr>
-      <w:r>
-        <w:t>2. Công cụ Mô phỏng Nâng CPA khi Học lại / Cải thiện (Điều 6 Khoản 2): Tính toán CPA mới khi thay thế điểm cũ bằng điểm cao nhất, tính độ tăng CPA (+0.xx) và xác định điều kiện thoát cảnh báo.</w:t>
-      </w:r>
-    </w:p>
-    <w:p>
-      <w:pPr>
-        <w:pStyle w:val="ListBullet"/>
-      </w:pPr>
-      <w:r>
-        <w:t>3. Công cụ Tính điểm Học phần theo tỷ lệ 10-30-60 (Điều 8): Tính điểm thang 10, quy đổi thang chữ A/B/C/D/F và thang 4, tự động phát hiện cấm thi nếu vắng &gt; 20% số tiết.</w:t>
-      </w:r>
-    </w:p>
-    <w:p>
-      <w:pPr>
-        <w:pStyle w:val="ListBullet"/>
-      </w:pPr>
-      <w:r>
-        <w:t>4. Công cụ Kiểm tra Điều kiện Tốt nghiệp &amp; Dự báo Xếp hạng (Điều 12 &amp; Điều 13): Đối chiếu 4 điều kiện tốt nghiệp, tự động kiểm tra quy định hạ 1 bậc tốt nghiệp nếu học lại &gt; 5% tổng tín chỉ.</w:t>
+        <w:t>Module `app/rule_engine.py` cung cấp 4 công cụ toán học chính xác 100% độc lập với LLM:</w:t>
+        <w:br/>
+        <w:t>1. Kiểm tra Cảnh báo học vụ &amp; Giới hạn tín chỉ (Điều 11 &amp; Điều 4).</w:t>
+        <w:br/>
+        <w:t>2. Mô phỏng Nâng CPA khi Học lại / Cải thiện điểm (Điều 6 Khoản 2).</w:t>
+        <w:br/>
+        <w:t>3. Tính Điểm Học phần theo tỷ lệ 10% CC + 30% GK + 60% CK (Điều 8).</w:t>
+        <w:br/>
+        <w:t>4. Kiểm tra 4 Điều kiện Tốt nghiệp &amp; Dự báo Xếp hạng bằng kèm kiểm tra quy định hạ 1 bậc tốt nghiệp (Điều 12 &amp; 13).</w:t>
       </w:r>
     </w:p>
     <w:tbl>
@@ -1195,7 +1036,7 @@
                 <w:color w:val="4F46E5"/>
                 <w:sz w:val="22"/>
               </w:rPr>
-              <w:t>KHUNG CHÈN ẢNH CHỤP THỰC TẾ: GIAO DIỆN BỘ MÔ PHỎNG &amp; TÍNH ĐIỂM HỌC VỤ (TAB 4)</w:t>
+              <w:t>KHUNG CHÈN ẢNH CHỤP THỰC TẾ HỆ THỐNG: GIAO DIỆN BỘ MÔ PHỎNG &amp; TÍNH ĐIỂM HỌC VỤ (TAB 4)</w:t>
               <w:br/>
             </w:r>
             <w:r>
@@ -1204,7 +1045,7 @@
                 <w:color w:val="475569"/>
                 <w:sz w:val="20"/>
               </w:rPr>
-              <w:t>👉 Hướng dẫn thao tác chụp ảnh:</w:t>
+              <w:t>👉 Kịch bản thao tác và chụp màn hình:</w:t>
               <w:br/>
               <w:t>1. Chuyển sang Tab '🧮 Mô Phỏng &amp; Tính Điểm Học Vụ'.</w:t>
               <w:br/>
@@ -1219,7 +1060,7 @@
                 <w:color w:val="10B981"/>
                 <w:sz w:val="19"/>
               </w:rPr>
-              <w:t>[ Nhấn Chuột Phải vào khung này -&gt; Chọn 'Add Image' (Chèn ảnh) để thay thế bằng ảnh chụp màn hình thực tế ]</w:t>
+              <w:t>[ Nhấn Chuột Phải vào khung này -&gt; Chọn 'Add Image' để chèn ảnh chụp màn hình thực tế từ trình duyệt ]</w:t>
             </w:r>
           </w:p>
         </w:tc>
@@ -1242,23 +1083,6 @@
     </w:p>
     <w:p>
       <w:pPr>
-        <w:spacing w:before="200"/>
-      </w:pPr>
-      <w:r>
-        <w:rPr>
-          <w:b/>
-          <w:sz w:val="24"/>
-        </w:rPr>
-        <w:t>2.5. Phân hệ 5: Bảng điều khiển Quản trị AI &amp; Kiểm tra Kết nối Trực tiếp</w:t>
-      </w:r>
-    </w:p>
-    <w:p>
-      <w:r>
-        <w:t>Hệ thống tích hợp bảng điều khiển linh hoạt trên giao diện web (nút ⚙️ góc trên bên phải), cho phép người dùng cấu hình linh hoạt: Google Gemini (hoàn toàn miễn phí qua AI Studio), OpenAI (GPT-4o-mini), Ollama Local (chạy offline trên máy), hoặc DeepSeek. Tính năng kiểm tra kết nối gọi trực tiếp endpoint `/api/ai/test` để đo độ trễ (latency ms) thực tế trước khi lưu cấu hình vào file `.env`.</w:t>
-      </w:r>
-    </w:p>
-    <w:p>
-      <w:pPr>
         <w:spacing w:before="240"/>
       </w:pPr>
     </w:p>
@@ -1277,55 +1101,19 @@
     </w:p>
     <w:p>
       <w:r>
-        <w:t>Quy trình xử lý một câu hỏi từ khi sinh viên nhấn 'Hỏi AI' đến khi nhận được câu trả lời hoàn chỉnh diễn ra theo chu trình 6 bước kỹ thuật khép kín tại endpoint `/api/chat/stream`:</w:t>
-      </w:r>
-    </w:p>
-    <w:p>
-      <w:pPr>
-        <w:pStyle w:val="ListBullet"/>
-      </w:pPr>
-      <w:r>
-        <w:t>• Bước 1: Tiếp nhận câu hỏi và chuẩn hóa chuỗi ký tự Tiếng Việt.</w:t>
-      </w:r>
-    </w:p>
-    <w:p>
-      <w:pPr>
-        <w:pStyle w:val="ListBullet"/>
-      </w:pPr>
-      <w:r>
-        <w:t>• Bước 2: Mã hóa véc-tơ câu hỏi bằng SentenceTransformer với tiền tố bắt buộc 'query: ' và chuẩn hóa véc-tơ L2 (normalize_embeddings=True).</w:t>
-      </w:r>
-    </w:p>
-    <w:p>
-      <w:pPr>
-        <w:pStyle w:val="ListBullet"/>
-      </w:pPr>
-      <w:r>
-        <w:t>• Bước 3: Truy vấn ChromaDB thu được Top-K=4 chunk có khoảng cách Cosine nhỏ nhất, quy đổi thành điểm tương đồng: Score = round(1.0 - distance, 3).</w:t>
-      </w:r>
-    </w:p>
-    <w:p>
-      <w:pPr>
-        <w:pStyle w:val="ListBullet"/>
-      </w:pPr>
-      <w:r>
-        <w:t>• Bước 4: Khởi tạo kênh Server-Sent Events (SSE), gửi ngay lập tức gói tin dữ liệu nguồn: data: {"event": "sources", "sources": [...]}.</w:t>
-      </w:r>
-    </w:p>
-    <w:p>
-      <w:pPr>
-        <w:pStyle w:val="ListBullet"/>
-      </w:pPr>
-      <w:r>
-        <w:t>• Bước 5: Ghép ngữ cảnh quy chế vào khuôn mẫu SYSTEM_PROMPT có ràng buộc trích dẫn pháp lý nghiêm ngặt.</w:t>
-      </w:r>
-    </w:p>
-    <w:p>
-      <w:pPr>
-        <w:pStyle w:val="ListBullet"/>
-      </w:pPr>
-      <w:r>
-        <w:t>• Bước 6: Gọi LLM qua giao diện Streaming, liên tục gửi các gói tin: data: {"event": "token", "token": "..."} và kết thúc bằng data: {"event": "done"}.</w:t>
+        <w:t>Quy trình xử lý một câu hỏi từ khi sinh viên nhấn 'Hỏi AI' đến khi nhận được phản hồi diễn ra theo chu trình 6 bước khép kín tại `/api/chat/stream`:</w:t>
+        <w:br/>
+        <w:t>• Bước 1: Tiếp nhận truy vấn, thực hiện chuẩn hóa ký tự tiếng Việt Unicode NFC bằng `unicodedata.normalize('NFC', text)`.</w:t>
+        <w:br/>
+        <w:t>• Bước 2: Mã hóa véc-tơ câu hỏi bằng SentenceTransformer với tiền tố 'query: ' và chuẩn hóa L2.</w:t>
+        <w:br/>
+        <w:t>• Bước 3: Truy vấn ChromaDB thu được Top-4 chunk có khoảng cách Cosine nhỏ nhất, tính `Score = round(1.0 - distance, 3)`.</w:t>
+        <w:br/>
+        <w:t>• Bước 4: Thiết lập kênh SSE, gửi ngay sự kiện đầu tiên `data: {"event": "sources", "sources": [...]}`.</w:t>
+        <w:br/>
+        <w:t>• Bước 5: Ghép ngữ cảnh các điều khoản vào SYSTEM_PROMPT có ràng buộc trích dẫn pháp lý nghiêm ngặt.</w:t>
+        <w:br/>
+        <w:t>• Bước 6: Gọi LLM qua giao diện streaming, liên tục gửi các gói `data: {"event": "token", "token": "..."}` và kết thúc bằng `data: {"event": "done"}.</w:t>
       </w:r>
     </w:p>
     <w:p>
@@ -1338,18 +1126,16 @@
         <w:rPr>
           <w:b/>
         </w:rPr>
-        <w:t>Cơ chế Dự phòng Thông minh (Multi-tier Smart Fallback Mode):</w:t>
+        <w:t>Cơ chế Tự phục hồi và Khả năng Chịu lỗi (Fault Tolerance):</w:t>
       </w:r>
     </w:p>
     <w:p>
       <w:r>
-        <w:t>Hệ thống thiết lập 3 tầng bảo vệ chống sự cố (Fault Tolerance):</w:t>
+        <w:t>1. Tự động khởi tạo và nạp Vector DB: Trong hàm `init_knowledge_base()`, nếu thư mục `data/chroma/` chưa tồn tại hoặc bị xóa, hệ thống tự động đọc `data/chunks.json`, sinh embedding và khởi tạo lại collection mà không gây sập ứng dụng (khắc phục hoàn toàn lỗi crash khi git clone).</w:t>
         <w:br/>
-        <w:t>1. Tầng LLM Resilient: Hàm `create_chat_completion_resilient` tự động luân chuyển model Gemini dự phòng khi gặp lỗi 404/429 Quota.</w:t>
+        <w:t>2. Tầng Model Fallback: Hàm `create_chat_completion_resilient` tự động luân chuyển model Gemini dự phòng khi gặp lỗi 429 Quota hoặc 404 Model Not Found.</w:t>
         <w:br/>
-        <w:t>2. Tầng Smart Fallback: Khi hoàn toàn mất mạng hoặc chưa cấu hình API Key, hàm `generate_smart_fallback_answer` tự động trích xuất nguyên văn có cấu trúc từ Top-1 và Top-3 chunk, đảm bảo sinh viên vẫn xem được quy chế chính xác mà không bao giờ gặp màn hình lỗi 500.</w:t>
-        <w:br/>
-        <w:t>3. Tầng Rule Engine: Các nghiệp vụ tính toán GPA và cảnh báo học vụ được bảo vệ bởi code toán học thuần túy trong `app/rule_engine.py`, loại bỏ 100% rủi ro tính nhầm do AI ảo giác.</w:t>
+        <w:t>3. Tầng Smart Fallback: Khi mất mạng hoặc chưa có API Key, hàm `generate_smart_fallback_answer` trích xuất nguyên văn có cấu trúc từ Top-1 và Top-3 chunk, giúp sinh viên luôn xem được quy chế chính xác.</w:t>
       </w:r>
     </w:p>
     <w:p>
@@ -1367,12 +1153,12 @@
           <w:color w:val="1E293B"/>
           <w:sz w:val="27"/>
         </w:rPr>
-        <w:t>PHẦN 4: ĐÁNH GIÁ THỰC NGHIỆM ĐỘ CHÍNH XÁC VÀ HIỆU NĂNG HỆ THỐNG</w:t>
+        <w:t>PHẦN 4: ĐÁNH GIÁ THỰC NGHIỆM ĐỊNH LƯỢNG ĐỘ CHÍNH XÁC VÀ HIỆU NĂNG</w:t>
       </w:r>
     </w:p>
     <w:p>
       <w:r>
-        <w:t>Để đánh giá một cách khoa học và định lượng hiệu quả của giải pháp RAG, đề tài đã xây dựng bộ kiểm thử thực nghiệm tự động hóa (`scripts/evaluate_rag.py`) với tập dữ liệu kiểm định chuẩn (Golden Benchmark Dataset) gồm 25 câu hỏi thực tế bao phủ toàn diện 7 nhóm chủ đề quy chế đào tạo đại học.</w:t>
+        <w:t>Để bảo đảm tính khách quan, khoa học và đáp ứng đầy đủ yêu cầu của một đồ án tốt nghiệp, đề tài đã xây dựng bộ kiểm thử thực nghiệm toàn diện (`scripts/evaluate_rag.py`) với tập dữ liệu kiểm định chuẩn gồm 75 câu hỏi có gán nhãn ground-truth: gồm 65 câu hỏi trong phạm vi quy chế (chia thành các nhóm định lượng, điều kiện, thủ tục, tốt nghiệp, kỷ luật, câu hỏi diễn đạt lại, câu hỏi đa điều khoản) và 10 câu hỏi ngoài phạm vi để kiểm tra khả năng từ chối trả lời.</w:t>
       </w:r>
     </w:p>
     <w:p>
@@ -1381,49 +1167,12 @@
           <w:b/>
           <w:sz w:val="24"/>
         </w:rPr>
-        <w:t>4.1. Thiết lập Môi trường Thực nghiệm</w:t>
+        <w:t>4.1. Thực nghiệm 1: So sánh Hiệu quả Truy xuất Dense Vector (E5) và Baseline BM25</w:t>
       </w:r>
     </w:p>
     <w:p>
       <w:r>
-        <w:t>• Hệ điều hành: Windows 11 64-bit | Ngôn ngữ: Python 3.12 (Virtual Environment .venv).</w:t>
-        <w:br/>
-        <w:t>• Framework AI: PyTorch 2.x, Sentence-Transformers, HuggingFace Hub.</w:t>
-        <w:br/>
-        <w:t>• Mô hình nhúng (Embedding Model): intfloat/multilingual-e5-small (384 dimensions, cosine distance).</w:t>
-        <w:br/>
-        <w:t>• Cơ sở dữ liệu véc-tơ: ChromaDB 0.6.x (PersistentClient lưu trên ổ cứng SSD).</w:t>
-        <w:br/>
-        <w:t>• Tập dữ liệu quy chế: 16 chunk phân đoạn theo 16 Điều văn bản quy chế đào tạo đại học chính quy.</w:t>
-      </w:r>
-    </w:p>
-    <w:p>
-      <w:r>
-        <w:rPr>
-          <w:b/>
-          <w:sz w:val="24"/>
-        </w:rPr>
-        <w:t>4.2. Các Chỉ số Đánh giá Định lượng (Evaluation Metrics)</w:t>
-      </w:r>
-    </w:p>
-    <w:p>
-      <w:r>
-        <w:t>1. Hit@K (Top-K Accuracy, K = 1, 3, 5): Tỷ lệ phần trăm các câu hỏi mà Điều khoản chứa đáp án đúng nằm trong Top-K kết quả truy xuất.</w:t>
-        <w:br/>
-        <w:t>2. MRR (Mean Reciprocal Rank): Điểm nghịch đảo thứ hạng trung bình của kết quả đúng đầu tiên (thang điểm từ 0 đến 1.0; điểm càng gần 1.0 thì kết quả đúng càng luôn nằm ở vị trí số 1).</w:t>
-        <w:br/>
-        <w:t>3. Embedding Latency (ms): Thời gian CPU/GPU mã hóa câu hỏi thành véc-tơ số thực 384 chiều.</w:t>
-        <w:br/>
-        <w:t>4. ChromaDB Retrieval Latency (ms): Thời gian tìm kiếm tương đồng véc-tơ trong cơ sở dữ liệu.</w:t>
-      </w:r>
-    </w:p>
-    <w:p>
-      <w:r>
-        <w:rPr>
-          <w:b/>
-          <w:sz w:val="24"/>
-        </w:rPr>
-        <w:t>4.3. Bảng Kết quả Thực nghiệm Tổng hợp</w:t>
+        <w:t>Thực nghiệm so sánh phương pháp tìm kiếm từ khóa truyền thống Okapi BM25 với mô hình nhúng ngữ nghĩa hiện đại Multilingual-E5-Small trên 65 câu hỏi in-scope:</w:t>
       </w:r>
     </w:p>
     <w:p>
@@ -1432,543 +1181,7 @@
           <w:b/>
           <w:sz w:val="22"/>
         </w:rPr>
-        <w:t>Bảng 4.1: Kết quả kiểm thử thực nghiệm độ chính xác truy xuất và thời gian xử lý của hệ thống RAG</w:t>
-      </w:r>
-    </w:p>
-    <w:tbl>
-      <w:tblPr>
-        <w:tblW w:type="auto" w:w="0"/>
-        <w:jc w:val="center"/>
-        <w:tblLook w:firstColumn="1" w:firstRow="1" w:lastColumn="0" w:lastRow="0" w:noHBand="0" w:noVBand="1" w:val="04A0"/>
-      </w:tblPr>
-      <w:tblGrid>
-        <w:gridCol w:w="3216"/>
-        <w:gridCol w:w="3216"/>
-        <w:gridCol w:w="3216"/>
-      </w:tblGrid>
-      <w:tr>
-        <w:tc>
-          <w:tcPr>
-            <w:tcW w:type="dxa" w:w="3216"/>
-            <w:shd w:fill="E2E8F0"/>
-            <w:tcMar>
-              <w:top w:w="80" w:type="dxa"/>
-              <w:bottom w:w="80" w:type="dxa"/>
-              <w:left w:w="100" w:type="dxa"/>
-              <w:right w:w="100" w:type="dxa"/>
-            </w:tcMar>
-          </w:tcPr>
-          <w:p>
-            <w:r>
-              <w:rPr>
-                <w:b/>
-              </w:rPr>
-              <w:t>Chỉ số đánh giá thực nghiệm</w:t>
-            </w:r>
-          </w:p>
-        </w:tc>
-        <w:tc>
-          <w:tcPr>
-            <w:tcW w:type="dxa" w:w="3216"/>
-            <w:shd w:fill="E2E8F0"/>
-            <w:tcMar>
-              <w:top w:w="80" w:type="dxa"/>
-              <w:bottom w:w="80" w:type="dxa"/>
-              <w:left w:w="100" w:type="dxa"/>
-              <w:right w:w="100" w:type="dxa"/>
-            </w:tcMar>
-          </w:tcPr>
-          <w:p>
-            <w:r>
-              <w:rPr>
-                <w:b/>
-              </w:rPr>
-              <w:t>Kết quả đo đạc thực tế</w:t>
-            </w:r>
-          </w:p>
-        </w:tc>
-        <w:tc>
-          <w:tcPr>
-            <w:tcW w:type="dxa" w:w="3216"/>
-            <w:shd w:fill="E2E8F0"/>
-            <w:tcMar>
-              <w:top w:w="80" w:type="dxa"/>
-              <w:bottom w:w="80" w:type="dxa"/>
-              <w:left w:w="100" w:type="dxa"/>
-              <w:right w:w="100" w:type="dxa"/>
-            </w:tcMar>
-          </w:tcPr>
-          <w:p>
-            <w:r>
-              <w:rPr>
-                <w:b/>
-              </w:rPr>
-              <w:t>Ý nghĩa khoa học trong đồ án</w:t>
-            </w:r>
-          </w:p>
-        </w:tc>
-      </w:tr>
-      <w:tr>
-        <w:tc>
-          <w:tcPr>
-            <w:tcW w:type="dxa" w:w="3216"/>
-            <w:shd w:fill="FFFFFF"/>
-            <w:tcMar>
-              <w:top w:w="70" w:type="dxa"/>
-              <w:bottom w:w="70" w:type="dxa"/>
-              <w:left w:w="100" w:type="dxa"/>
-              <w:right w:w="100" w:type="dxa"/>
-            </w:tcMar>
-          </w:tcPr>
-          <w:p>
-            <w:r>
-              <w:rPr>
-                <w:sz w:val="20"/>
-              </w:rPr>
-              <w:t>Tổng số kịch bản kiểm thử (N)</w:t>
-            </w:r>
-          </w:p>
-        </w:tc>
-        <w:tc>
-          <w:tcPr>
-            <w:tcW w:type="dxa" w:w="3216"/>
-            <w:shd w:fill="FFFFFF"/>
-            <w:tcMar>
-              <w:top w:w="70" w:type="dxa"/>
-              <w:bottom w:w="70" w:type="dxa"/>
-              <w:left w:w="100" w:type="dxa"/>
-              <w:right w:w="100" w:type="dxa"/>
-            </w:tcMar>
-          </w:tcPr>
-          <w:p>
-            <w:r>
-              <w:rPr>
-                <w:b/>
-                <w:color w:val="4F46E5"/>
-                <w:sz w:val="20"/>
-              </w:rPr>
-              <w:t>25 câu hỏi</w:t>
-            </w:r>
-          </w:p>
-        </w:tc>
-        <w:tc>
-          <w:tcPr>
-            <w:tcW w:type="dxa" w:w="3216"/>
-            <w:shd w:fill="FFFFFF"/>
-            <w:tcMar>
-              <w:top w:w="70" w:type="dxa"/>
-              <w:bottom w:w="70" w:type="dxa"/>
-              <w:left w:w="100" w:type="dxa"/>
-              <w:right w:w="100" w:type="dxa"/>
-            </w:tcMar>
-          </w:tcPr>
-          <w:p>
-            <w:r>
-              <w:rPr>
-                <w:sz w:val="20"/>
-              </w:rPr>
-              <w:t>Bao phủ 100% 16 Điều của Quy chế đào tạo</w:t>
-            </w:r>
-          </w:p>
-        </w:tc>
-      </w:tr>
-      <w:tr>
-        <w:tc>
-          <w:tcPr>
-            <w:tcW w:type="dxa" w:w="3216"/>
-            <w:shd w:fill="F8FAFC"/>
-            <w:tcMar>
-              <w:top w:w="70" w:type="dxa"/>
-              <w:bottom w:w="70" w:type="dxa"/>
-              <w:left w:w="100" w:type="dxa"/>
-              <w:right w:w="100" w:type="dxa"/>
-            </w:tcMar>
-          </w:tcPr>
-          <w:p>
-            <w:r>
-              <w:rPr>
-                <w:sz w:val="20"/>
-              </w:rPr>
-              <w:t>Độ chính xác Top-1 (Hit@1)</w:t>
-            </w:r>
-          </w:p>
-        </w:tc>
-        <w:tc>
-          <w:tcPr>
-            <w:tcW w:type="dxa" w:w="3216"/>
-            <w:shd w:fill="F8FAFC"/>
-            <w:tcMar>
-              <w:top w:w="70" w:type="dxa"/>
-              <w:bottom w:w="70" w:type="dxa"/>
-              <w:left w:w="100" w:type="dxa"/>
-              <w:right w:w="100" w:type="dxa"/>
-            </w:tcMar>
-          </w:tcPr>
-          <w:p>
-            <w:r>
-              <w:rPr>
-                <w:b/>
-                <w:color w:val="4F46E5"/>
-                <w:sz w:val="20"/>
-              </w:rPr>
-              <w:t>96.0% (24 / 25 câu)</w:t>
-            </w:r>
-          </w:p>
-        </w:tc>
-        <w:tc>
-          <w:tcPr>
-            <w:tcW w:type="dxa" w:w="3216"/>
-            <w:shd w:fill="F8FAFC"/>
-            <w:tcMar>
-              <w:top w:w="70" w:type="dxa"/>
-              <w:bottom w:w="70" w:type="dxa"/>
-              <w:left w:w="100" w:type="dxa"/>
-              <w:right w:w="100" w:type="dxa"/>
-            </w:tcMar>
-          </w:tcPr>
-          <w:p>
-            <w:r>
-              <w:rPr>
-                <w:sz w:val="20"/>
-              </w:rPr>
-              <w:t>96% câu hỏi có Điều luật chuẩn xác đứng ngay vị trí đầu tiên</w:t>
-            </w:r>
-          </w:p>
-        </w:tc>
-      </w:tr>
-      <w:tr>
-        <w:tc>
-          <w:tcPr>
-            <w:tcW w:type="dxa" w:w="3216"/>
-            <w:shd w:fill="FFFFFF"/>
-            <w:tcMar>
-              <w:top w:w="70" w:type="dxa"/>
-              <w:bottom w:w="70" w:type="dxa"/>
-              <w:left w:w="100" w:type="dxa"/>
-              <w:right w:w="100" w:type="dxa"/>
-            </w:tcMar>
-          </w:tcPr>
-          <w:p>
-            <w:r>
-              <w:rPr>
-                <w:sz w:val="20"/>
-              </w:rPr>
-              <w:t>Độ chính xác Top-3 (Hit@3)</w:t>
-            </w:r>
-          </w:p>
-        </w:tc>
-        <w:tc>
-          <w:tcPr>
-            <w:tcW w:type="dxa" w:w="3216"/>
-            <w:shd w:fill="FFFFFF"/>
-            <w:tcMar>
-              <w:top w:w="70" w:type="dxa"/>
-              <w:bottom w:w="70" w:type="dxa"/>
-              <w:left w:w="100" w:type="dxa"/>
-              <w:right w:w="100" w:type="dxa"/>
-            </w:tcMar>
-          </w:tcPr>
-          <w:p>
-            <w:r>
-              <w:rPr>
-                <w:b/>
-                <w:color w:val="4F46E5"/>
-                <w:sz w:val="20"/>
-              </w:rPr>
-              <w:t>100.0% (25 / 25 câu)</w:t>
-            </w:r>
-          </w:p>
-        </w:tc>
-        <w:tc>
-          <w:tcPr>
-            <w:tcW w:type="dxa" w:w="3216"/>
-            <w:shd w:fill="FFFFFF"/>
-            <w:tcMar>
-              <w:top w:w="70" w:type="dxa"/>
-              <w:bottom w:w="70" w:type="dxa"/>
-              <w:left w:w="100" w:type="dxa"/>
-              <w:right w:w="100" w:type="dxa"/>
-            </w:tcMar>
-          </w:tcPr>
-          <w:p>
-            <w:r>
-              <w:rPr>
-                <w:sz w:val="20"/>
-              </w:rPr>
-              <w:t>100% câu hỏi có Điều luật chuẩn xác nằm trong Top-3 trích xuất</w:t>
-            </w:r>
-          </w:p>
-        </w:tc>
-      </w:tr>
-      <w:tr>
-        <w:tc>
-          <w:tcPr>
-            <w:tcW w:type="dxa" w:w="3216"/>
-            <w:shd w:fill="F8FAFC"/>
-            <w:tcMar>
-              <w:top w:w="70" w:type="dxa"/>
-              <w:bottom w:w="70" w:type="dxa"/>
-              <w:left w:w="100" w:type="dxa"/>
-              <w:right w:w="100" w:type="dxa"/>
-            </w:tcMar>
-          </w:tcPr>
-          <w:p>
-            <w:r>
-              <w:rPr>
-                <w:sz w:val="20"/>
-              </w:rPr>
-              <w:t>Độ chính xác Top-5 (Hit@5)</w:t>
-            </w:r>
-          </w:p>
-        </w:tc>
-        <w:tc>
-          <w:tcPr>
-            <w:tcW w:type="dxa" w:w="3216"/>
-            <w:shd w:fill="F8FAFC"/>
-            <w:tcMar>
-              <w:top w:w="70" w:type="dxa"/>
-              <w:bottom w:w="70" w:type="dxa"/>
-              <w:left w:w="100" w:type="dxa"/>
-              <w:right w:w="100" w:type="dxa"/>
-            </w:tcMar>
-          </w:tcPr>
-          <w:p>
-            <w:r>
-              <w:rPr>
-                <w:b/>
-                <w:color w:val="4F46E5"/>
-                <w:sz w:val="20"/>
-              </w:rPr>
-              <w:t>100.0% (25 / 25 câu)</w:t>
-            </w:r>
-          </w:p>
-        </w:tc>
-        <w:tc>
-          <w:tcPr>
-            <w:tcW w:type="dxa" w:w="3216"/>
-            <w:shd w:fill="F8FAFC"/>
-            <w:tcMar>
-              <w:top w:w="70" w:type="dxa"/>
-              <w:bottom w:w="70" w:type="dxa"/>
-              <w:left w:w="100" w:type="dxa"/>
-              <w:right w:w="100" w:type="dxa"/>
-            </w:tcMar>
-          </w:tcPr>
-          <w:p>
-            <w:r>
-              <w:rPr>
-                <w:sz w:val="20"/>
-              </w:rPr>
-              <w:t>Đảm bảo không bỏ sót bất kỳ căn cứ pháp lý quan trọng nào</w:t>
-            </w:r>
-          </w:p>
-        </w:tc>
-      </w:tr>
-      <w:tr>
-        <w:tc>
-          <w:tcPr>
-            <w:tcW w:type="dxa" w:w="3216"/>
-            <w:shd w:fill="FFFFFF"/>
-            <w:tcMar>
-              <w:top w:w="70" w:type="dxa"/>
-              <w:bottom w:w="70" w:type="dxa"/>
-              <w:left w:w="100" w:type="dxa"/>
-              <w:right w:w="100" w:type="dxa"/>
-            </w:tcMar>
-          </w:tcPr>
-          <w:p>
-            <w:r>
-              <w:rPr>
-                <w:sz w:val="20"/>
-              </w:rPr>
-              <w:t>Điểm MRR (Mean Reciprocal Rank)</w:t>
-            </w:r>
-          </w:p>
-        </w:tc>
-        <w:tc>
-          <w:tcPr>
-            <w:tcW w:type="dxa" w:w="3216"/>
-            <w:shd w:fill="FFFFFF"/>
-            <w:tcMar>
-              <w:top w:w="70" w:type="dxa"/>
-              <w:bottom w:w="70" w:type="dxa"/>
-              <w:left w:w="100" w:type="dxa"/>
-              <w:right w:w="100" w:type="dxa"/>
-            </w:tcMar>
-          </w:tcPr>
-          <w:p>
-            <w:r>
-              <w:rPr>
-                <w:b/>
-                <w:color w:val="4F46E5"/>
-                <w:sz w:val="20"/>
-              </w:rPr>
-              <w:t>0.980 / 1.000</w:t>
-            </w:r>
-          </w:p>
-        </w:tc>
-        <w:tc>
-          <w:tcPr>
-            <w:tcW w:type="dxa" w:w="3216"/>
-            <w:shd w:fill="FFFFFF"/>
-            <w:tcMar>
-              <w:top w:w="70" w:type="dxa"/>
-              <w:bottom w:w="70" w:type="dxa"/>
-              <w:left w:w="100" w:type="dxa"/>
-              <w:right w:w="100" w:type="dxa"/>
-            </w:tcMar>
-          </w:tcPr>
-          <w:p>
-            <w:r>
-              <w:rPr>
-                <w:sz w:val="20"/>
-              </w:rPr>
-              <w:t>Đạt mức xuất sắc, kết quả đúng gần như tuyệt đối ở vị trí số 1</w:t>
-            </w:r>
-          </w:p>
-        </w:tc>
-      </w:tr>
-      <w:tr>
-        <w:tc>
-          <w:tcPr>
-            <w:tcW w:type="dxa" w:w="3216"/>
-            <w:shd w:fill="F8FAFC"/>
-            <w:tcMar>
-              <w:top w:w="70" w:type="dxa"/>
-              <w:bottom w:w="70" w:type="dxa"/>
-              <w:left w:w="100" w:type="dxa"/>
-              <w:right w:w="100" w:type="dxa"/>
-            </w:tcMar>
-          </w:tcPr>
-          <w:p>
-            <w:r>
-              <w:rPr>
-                <w:sz w:val="20"/>
-              </w:rPr>
-              <w:t>Thời gian mã hóa véc-tơ E5 trung bình</w:t>
-            </w:r>
-          </w:p>
-        </w:tc>
-        <w:tc>
-          <w:tcPr>
-            <w:tcW w:type="dxa" w:w="3216"/>
-            <w:shd w:fill="F8FAFC"/>
-            <w:tcMar>
-              <w:top w:w="70" w:type="dxa"/>
-              <w:bottom w:w="70" w:type="dxa"/>
-              <w:left w:w="100" w:type="dxa"/>
-              <w:right w:w="100" w:type="dxa"/>
-            </w:tcMar>
-          </w:tcPr>
-          <w:p>
-            <w:r>
-              <w:rPr>
-                <w:b/>
-                <w:color w:val="4F46E5"/>
-                <w:sz w:val="20"/>
-              </w:rPr>
-              <w:t>81.51 ms / câu</w:t>
-            </w:r>
-          </w:p>
-        </w:tc>
-        <w:tc>
-          <w:tcPr>
-            <w:tcW w:type="dxa" w:w="3216"/>
-            <w:shd w:fill="F8FAFC"/>
-            <w:tcMar>
-              <w:top w:w="70" w:type="dxa"/>
-              <w:bottom w:w="70" w:type="dxa"/>
-              <w:left w:w="100" w:type="dxa"/>
-              <w:right w:w="100" w:type="dxa"/>
-            </w:tcMar>
-          </w:tcPr>
-          <w:p>
-            <w:r>
-              <w:rPr>
-                <w:sz w:val="20"/>
-              </w:rPr>
-              <w:t>Mô hình multilingual-e5-small hoạt động rất nhẹ trên CPU thông thường</w:t>
-            </w:r>
-          </w:p>
-        </w:tc>
-      </w:tr>
-      <w:tr>
-        <w:tc>
-          <w:tcPr>
-            <w:tcW w:type="dxa" w:w="3216"/>
-            <w:shd w:fill="FFFFFF"/>
-            <w:tcMar>
-              <w:top w:w="70" w:type="dxa"/>
-              <w:bottom w:w="70" w:type="dxa"/>
-              <w:left w:w="100" w:type="dxa"/>
-              <w:right w:w="100" w:type="dxa"/>
-            </w:tcMar>
-          </w:tcPr>
-          <w:p>
-            <w:r>
-              <w:rPr>
-                <w:sz w:val="20"/>
-              </w:rPr>
-              <w:t>Thời gian tìm kiếm ChromaDB trung bình</w:t>
-            </w:r>
-          </w:p>
-        </w:tc>
-        <w:tc>
-          <w:tcPr>
-            <w:tcW w:type="dxa" w:w="3216"/>
-            <w:shd w:fill="FFFFFF"/>
-            <w:tcMar>
-              <w:top w:w="70" w:type="dxa"/>
-              <w:bottom w:w="70" w:type="dxa"/>
-              <w:left w:w="100" w:type="dxa"/>
-              <w:right w:w="100" w:type="dxa"/>
-            </w:tcMar>
-          </w:tcPr>
-          <w:p>
-            <w:r>
-              <w:rPr>
-                <w:b/>
-                <w:color w:val="4F46E5"/>
-                <w:sz w:val="20"/>
-              </w:rPr>
-              <w:t>4.29 ms / câu</w:t>
-            </w:r>
-          </w:p>
-        </w:tc>
-        <w:tc>
-          <w:tcPr>
-            <w:tcW w:type="dxa" w:w="3216"/>
-            <w:shd w:fill="FFFFFF"/>
-            <w:tcMar>
-              <w:top w:w="70" w:type="dxa"/>
-              <w:bottom w:w="70" w:type="dxa"/>
-              <w:left w:w="100" w:type="dxa"/>
-              <w:right w:w="100" w:type="dxa"/>
-            </w:tcMar>
-          </w:tcPr>
-          <w:p>
-            <w:r>
-              <w:rPr>
-                <w:sz w:val="20"/>
-              </w:rPr>
-              <w:t>Truy vấn véc-tơ cực nhanh nhờ chỉ mục không gian ChromaDB</w:t>
-            </w:r>
-          </w:p>
-        </w:tc>
-      </w:tr>
-    </w:tbl>
-    <w:p>
-      <w:pPr>
-        <w:spacing w:before="160"/>
-      </w:pPr>
-    </w:p>
-    <w:p>
-      <w:r>
-        <w:rPr>
-          <w:b/>
-          <w:sz w:val="22"/>
-        </w:rPr>
-        <w:t>Bảng 4.2: Độ chính xác truy xuất phân rã theo 7 nhóm nghiệp vụ quy chế học vụ</w:t>
+        <w:t>Bảng 4.1: So sánh hiệu quả truy xuất giữa Baseline BM25 và Dense Vector Multilingual-E5-Small</w:t>
       </w:r>
     </w:p>
     <w:tbl>
@@ -2001,27 +1214,7 @@
               <w:rPr>
                 <w:b/>
               </w:rPr>
-              <w:t>Nhóm nghiệp vụ quy chế</w:t>
-            </w:r>
-          </w:p>
-        </w:tc>
-        <w:tc>
-          <w:tcPr>
-            <w:tcW w:type="dxa" w:w="1930"/>
-            <w:shd w:fill="E2E8F0"/>
-            <w:tcMar>
-              <w:top w:w="80" w:type="dxa"/>
-              <w:bottom w:w="80" w:type="dxa"/>
-              <w:left w:w="100" w:type="dxa"/>
-              <w:right w:w="100" w:type="dxa"/>
-            </w:tcMar>
-          </w:tcPr>
-          <w:p>
-            <w:r>
-              <w:rPr>
-                <w:b/>
-              </w:rPr>
-              <w:t>Số câu</w:t>
+              <w:t>Phương pháp truy xuất</w:t>
             </w:r>
           </w:p>
         </w:tc>
@@ -2081,6 +1274,26 @@
               <w:rPr>
                 <w:b/>
               </w:rPr>
+              <w:t>Hit@5 (%)</w:t>
+            </w:r>
+          </w:p>
+        </w:tc>
+        <w:tc>
+          <w:tcPr>
+            <w:tcW w:type="dxa" w:w="1930"/>
+            <w:shd w:fill="E2E8F0"/>
+            <w:tcMar>
+              <w:top w:w="80" w:type="dxa"/>
+              <w:bottom w:w="80" w:type="dxa"/>
+              <w:left w:w="100" w:type="dxa"/>
+              <w:right w:w="100" w:type="dxa"/>
+            </w:tcMar>
+          </w:tcPr>
+          <w:p>
+            <w:r>
+              <w:rPr>
+                <w:b/>
+              </w:rPr>
               <w:t>Điểm MRR</w:t>
             </w:r>
           </w:p>
@@ -2103,27 +1316,7 @@
               <w:rPr>
                 <w:sz w:val="20"/>
               </w:rPr>
-              <w:t>Quy định chung &amp; Tín chỉ</w:t>
-            </w:r>
-          </w:p>
-        </w:tc>
-        <w:tc>
-          <w:tcPr>
-            <w:tcW w:type="dxa" w:w="1930"/>
-            <w:shd w:fill="FFFFFF"/>
-            <w:tcMar>
-              <w:top w:w="70" w:type="dxa"/>
-              <w:bottom w:w="70" w:type="dxa"/>
-              <w:left w:w="100" w:type="dxa"/>
-              <w:right w:w="100" w:type="dxa"/>
-            </w:tcMar>
-          </w:tcPr>
-          <w:p>
-            <w:r>
-              <w:rPr>
-                <w:sz w:val="20"/>
-              </w:rPr>
-              <w:t>3</w:t>
+              <w:t>Baseline BM25 (Sparse Keyword)</w:t>
             </w:r>
           </w:p>
         </w:tc>
@@ -2144,7 +1337,7 @@
                 <w:b/>
                 <w:sz w:val="20"/>
               </w:rPr>
-              <w:t>100.0%</w:t>
+              <w:t>93.85%</w:t>
             </w:r>
           </w:p>
         </w:tc>
@@ -2165,7 +1358,7 @@
                 <w:b/>
                 <w:sz w:val="20"/>
               </w:rPr>
-              <w:t>100.0%</w:t>
+              <w:t>98.46%</w:t>
             </w:r>
           </w:p>
         </w:tc>
@@ -2186,7 +1379,28 @@
                 <w:b/>
                 <w:sz w:val="20"/>
               </w:rPr>
-              <w:t>1.000</w:t>
+              <w:t>100.00%</w:t>
+            </w:r>
+          </w:p>
+        </w:tc>
+        <w:tc>
+          <w:tcPr>
+            <w:tcW w:type="dxa" w:w="1930"/>
+            <w:shd w:fill="FFFFFF"/>
+            <w:tcMar>
+              <w:top w:w="70" w:type="dxa"/>
+              <w:bottom w:w="70" w:type="dxa"/>
+              <w:left w:w="100" w:type="dxa"/>
+              <w:right w:w="100" w:type="dxa"/>
+            </w:tcMar>
+          </w:tcPr>
+          <w:p>
+            <w:r>
+              <w:rPr>
+                <w:b/>
+                <w:sz w:val="20"/>
+              </w:rPr>
+              <w:t>0.9628</w:t>
             </w:r>
           </w:p>
         </w:tc>
@@ -2208,27 +1422,7 @@
               <w:rPr>
                 <w:sz w:val="20"/>
               </w:rPr>
-              <w:t>Đăng ký &amp; Rút học phần</w:t>
-            </w:r>
-          </w:p>
-        </w:tc>
-        <w:tc>
-          <w:tcPr>
-            <w:tcW w:type="dxa" w:w="1930"/>
-            <w:shd w:fill="F8FAFC"/>
-            <w:tcMar>
-              <w:top w:w="70" w:type="dxa"/>
-              <w:bottom w:w="70" w:type="dxa"/>
-              <w:left w:w="100" w:type="dxa"/>
-              <w:right w:w="100" w:type="dxa"/>
-            </w:tcMar>
-          </w:tcPr>
-          <w:p>
-            <w:r>
-              <w:rPr>
-                <w:sz w:val="20"/>
-              </w:rPr>
-              <w:t>5</w:t>
+              <w:t>Dense Vector (Multilingual-E5-Small)</w:t>
             </w:r>
           </w:p>
         </w:tc>
@@ -2249,7 +1443,7 @@
                 <w:b/>
                 <w:sz w:val="20"/>
               </w:rPr>
-              <w:t>100.0%</w:t>
+              <w:t>92.31%</w:t>
             </w:r>
           </w:p>
         </w:tc>
@@ -2270,7 +1464,7 @@
                 <w:b/>
                 <w:sz w:val="20"/>
               </w:rPr>
-              <w:t>100.0%</w:t>
+              <w:t>95.38%</w:t>
             </w:r>
           </w:p>
         </w:tc>
@@ -2291,154 +1485,7 @@
                 <w:b/>
                 <w:sz w:val="20"/>
               </w:rPr>
-              <w:t>1.000</w:t>
-            </w:r>
-          </w:p>
-        </w:tc>
-      </w:tr>
-      <w:tr>
-        <w:tc>
-          <w:tcPr>
-            <w:tcW w:type="dxa" w:w="1930"/>
-            <w:shd w:fill="FFFFFF"/>
-            <w:tcMar>
-              <w:top w:w="70" w:type="dxa"/>
-              <w:bottom w:w="70" w:type="dxa"/>
-              <w:left w:w="100" w:type="dxa"/>
-              <w:right w:w="100" w:type="dxa"/>
-            </w:tcMar>
-          </w:tcPr>
-          <w:p>
-            <w:r>
-              <w:rPr>
-                <w:sz w:val="20"/>
-              </w:rPr>
-              <w:t>Học lại &amp; Cải thiện điểm</w:t>
-            </w:r>
-          </w:p>
-        </w:tc>
-        <w:tc>
-          <w:tcPr>
-            <w:tcW w:type="dxa" w:w="1930"/>
-            <w:shd w:fill="FFFFFF"/>
-            <w:tcMar>
-              <w:top w:w="70" w:type="dxa"/>
-              <w:bottom w:w="70" w:type="dxa"/>
-              <w:left w:w="100" w:type="dxa"/>
-              <w:right w:w="100" w:type="dxa"/>
-            </w:tcMar>
-          </w:tcPr>
-          <w:p>
-            <w:r>
-              <w:rPr>
-                <w:sz w:val="20"/>
-              </w:rPr>
-              <w:t>3</w:t>
-            </w:r>
-          </w:p>
-        </w:tc>
-        <w:tc>
-          <w:tcPr>
-            <w:tcW w:type="dxa" w:w="1930"/>
-            <w:shd w:fill="FFFFFF"/>
-            <w:tcMar>
-              <w:top w:w="70" w:type="dxa"/>
-              <w:bottom w:w="70" w:type="dxa"/>
-              <w:left w:w="100" w:type="dxa"/>
-              <w:right w:w="100" w:type="dxa"/>
-            </w:tcMar>
-          </w:tcPr>
-          <w:p>
-            <w:r>
-              <w:rPr>
-                <w:b/>
-                <w:sz w:val="20"/>
-              </w:rPr>
-              <w:t>100.0%</w:t>
-            </w:r>
-          </w:p>
-        </w:tc>
-        <w:tc>
-          <w:tcPr>
-            <w:tcW w:type="dxa" w:w="1930"/>
-            <w:shd w:fill="FFFFFF"/>
-            <w:tcMar>
-              <w:top w:w="70" w:type="dxa"/>
-              <w:bottom w:w="70" w:type="dxa"/>
-              <w:left w:w="100" w:type="dxa"/>
-              <w:right w:w="100" w:type="dxa"/>
-            </w:tcMar>
-          </w:tcPr>
-          <w:p>
-            <w:r>
-              <w:rPr>
-                <w:b/>
-                <w:sz w:val="20"/>
-              </w:rPr>
-              <w:t>100.0%</w:t>
-            </w:r>
-          </w:p>
-        </w:tc>
-        <w:tc>
-          <w:tcPr>
-            <w:tcW w:type="dxa" w:w="1930"/>
-            <w:shd w:fill="FFFFFF"/>
-            <w:tcMar>
-              <w:top w:w="70" w:type="dxa"/>
-              <w:bottom w:w="70" w:type="dxa"/>
-              <w:left w:w="100" w:type="dxa"/>
-              <w:right w:w="100" w:type="dxa"/>
-            </w:tcMar>
-          </w:tcPr>
-          <w:p>
-            <w:r>
-              <w:rPr>
-                <w:b/>
-                <w:sz w:val="20"/>
-              </w:rPr>
-              <w:t>1.000</w:t>
-            </w:r>
-          </w:p>
-        </w:tc>
-      </w:tr>
-      <w:tr>
-        <w:tc>
-          <w:tcPr>
-            <w:tcW w:type="dxa" w:w="1930"/>
-            <w:shd w:fill="F8FAFC"/>
-            <w:tcMar>
-              <w:top w:w="70" w:type="dxa"/>
-              <w:bottom w:w="70" w:type="dxa"/>
-              <w:left w:w="100" w:type="dxa"/>
-              <w:right w:w="100" w:type="dxa"/>
-            </w:tcMar>
-          </w:tcPr>
-          <w:p>
-            <w:r>
-              <w:rPr>
-                <w:sz w:val="20"/>
-              </w:rPr>
-              <w:t>Đánh giá &amp; Thang điểm</w:t>
-            </w:r>
-          </w:p>
-        </w:tc>
-        <w:tc>
-          <w:tcPr>
-            <w:tcW w:type="dxa" w:w="1930"/>
-            <w:shd w:fill="F8FAFC"/>
-            <w:tcMar>
-              <w:top w:w="70" w:type="dxa"/>
-              <w:bottom w:w="70" w:type="dxa"/>
-              <w:left w:w="100" w:type="dxa"/>
-              <w:right w:w="100" w:type="dxa"/>
-            </w:tcMar>
-          </w:tcPr>
-          <w:p>
-            <w:r>
-              <w:rPr>
-                <w:sz w:val="20"/>
-              </w:rPr>
-              <w:t>4</w:t>
+              <w:t>96.92%</w:t>
             </w:r>
           </w:p>
         </w:tc>
@@ -2459,13 +1506,241 @@
                 <w:b/>
                 <w:sz w:val="20"/>
               </w:rPr>
-              <w:t>100.0%</w:t>
+              <w:t>0.9397</w:t>
+            </w:r>
+          </w:p>
+        </w:tc>
+      </w:tr>
+    </w:tbl>
+    <w:p>
+      <w:r>
+        <w:t>Phân tích kết quả chuyên sâu: Cả hai phương pháp đều đạt độ chính xác truy xuất rất cao (&gt; 92% Hit@1 và &gt; 95% Hit@3). Lý do BM25 đạt kết quả xuất sắc trên tập quy chế mẫu là vì văn bản pháp lý có tính định danh từ ngữ rất chặt chẽ (như 'cảnh báo học vụ', 'học cải thiện', 'rút bớt học phần', '14 tín chỉ'), giúp việc khớp từ khóa chính xác hoạt động cực tốt. Trong khi đó, Dense Vector E5 lại vượt trội ở nhóm câu hỏi diễn đạt lại (Paraphrased) khi sinh viên dùng từ lóng như 'tạch môn', 'rớt môn', 'đuổi học'. Kết quả thực nghiệm này cung cấp luận cứ khoa học vững chắc để đề tài đề xuất hướng nâng cấp Tìm kiếm lai (Hybrid Search: BM25 + Dense) trong tương lai.</w:t>
+      </w:r>
+    </w:p>
+    <w:p>
+      <w:pPr>
+        <w:spacing w:before="160"/>
+      </w:pPr>
+      <w:r>
+        <w:rPr>
+          <w:b/>
+          <w:sz w:val="24"/>
+        </w:rPr>
+        <w:t>4.2. Thực nghiệm 2: Nghiên cứu Triệt tiêu (Ablation Study)</w:t>
+      </w:r>
+    </w:p>
+    <w:p>
+      <w:r>
+        <w:rPr>
+          <w:b/>
+          <w:sz w:val="22"/>
+        </w:rPr>
+        <w:t>Bảng 4.2: Kết quả nghiên cứu triệt tiêu về vai trò của Tiền tố Asymmetric E5 và Cấu hình Top-K</w:t>
+      </w:r>
+    </w:p>
+    <w:tbl>
+      <w:tblPr>
+        <w:tblW w:type="auto" w:w="0"/>
+        <w:jc w:val="center"/>
+        <w:tblLook w:firstColumn="1" w:firstRow="1" w:lastColumn="0" w:lastRow="0" w:noHBand="0" w:noVBand="1" w:val="04A0"/>
+      </w:tblPr>
+      <w:tblGrid>
+        <w:gridCol w:w="2412"/>
+        <w:gridCol w:w="2412"/>
+        <w:gridCol w:w="2412"/>
+        <w:gridCol w:w="2412"/>
+      </w:tblGrid>
+      <w:tr>
+        <w:tc>
+          <w:tcPr>
+            <w:tcW w:type="dxa" w:w="2412"/>
+            <w:shd w:fill="E2E8F0"/>
+            <w:tcMar>
+              <w:top w:w="80" w:type="dxa"/>
+              <w:bottom w:w="80" w:type="dxa"/>
+              <w:left w:w="100" w:type="dxa"/>
+              <w:right w:w="100" w:type="dxa"/>
+            </w:tcMar>
+          </w:tcPr>
+          <w:p>
+            <w:r>
+              <w:rPr>
+                <w:b/>
+              </w:rPr>
+              <w:t>Cấu hình thử nghiệm</w:t>
             </w:r>
           </w:p>
         </w:tc>
         <w:tc>
           <w:tcPr>
-            <w:tcW w:type="dxa" w:w="1930"/>
+            <w:tcW w:type="dxa" w:w="2412"/>
+            <w:shd w:fill="E2E8F0"/>
+            <w:tcMar>
+              <w:top w:w="80" w:type="dxa"/>
+              <w:bottom w:w="80" w:type="dxa"/>
+              <w:left w:w="100" w:type="dxa"/>
+              <w:right w:w="100" w:type="dxa"/>
+            </w:tcMar>
+          </w:tcPr>
+          <w:p>
+            <w:r>
+              <w:rPr>
+                <w:b/>
+              </w:rPr>
+              <w:t>Hit@1 (%)</w:t>
+            </w:r>
+          </w:p>
+        </w:tc>
+        <w:tc>
+          <w:tcPr>
+            <w:tcW w:type="dxa" w:w="2412"/>
+            <w:shd w:fill="E2E8F0"/>
+            <w:tcMar>
+              <w:top w:w="80" w:type="dxa"/>
+              <w:bottom w:w="80" w:type="dxa"/>
+              <w:left w:w="100" w:type="dxa"/>
+              <w:right w:w="100" w:type="dxa"/>
+            </w:tcMar>
+          </w:tcPr>
+          <w:p>
+            <w:r>
+              <w:rPr>
+                <w:b/>
+              </w:rPr>
+              <w:t>Hit@3 (%)</w:t>
+            </w:r>
+          </w:p>
+        </w:tc>
+        <w:tc>
+          <w:tcPr>
+            <w:tcW w:type="dxa" w:w="2412"/>
+            <w:shd w:fill="E2E8F0"/>
+            <w:tcMar>
+              <w:top w:w="80" w:type="dxa"/>
+              <w:bottom w:w="80" w:type="dxa"/>
+              <w:left w:w="100" w:type="dxa"/>
+              <w:right w:w="100" w:type="dxa"/>
+            </w:tcMar>
+          </w:tcPr>
+          <w:p>
+            <w:r>
+              <w:rPr>
+                <w:b/>
+              </w:rPr>
+              <w:t>Điểm MRR</w:t>
+            </w:r>
+          </w:p>
+        </w:tc>
+      </w:tr>
+      <w:tr>
+        <w:tc>
+          <w:tcPr>
+            <w:tcW w:type="dxa" w:w="2412"/>
+            <w:shd w:fill="FFFFFF"/>
+            <w:tcMar>
+              <w:top w:w="70" w:type="dxa"/>
+              <w:bottom w:w="70" w:type="dxa"/>
+              <w:left w:w="100" w:type="dxa"/>
+              <w:right w:w="100" w:type="dxa"/>
+            </w:tcMar>
+          </w:tcPr>
+          <w:p>
+            <w:r>
+              <w:rPr>
+                <w:sz w:val="20"/>
+              </w:rPr>
+              <w:t>E5 Có tiền tố Asymmetric ('query:')</w:t>
+            </w:r>
+          </w:p>
+        </w:tc>
+        <w:tc>
+          <w:tcPr>
+            <w:tcW w:type="dxa" w:w="2412"/>
+            <w:shd w:fill="FFFFFF"/>
+            <w:tcMar>
+              <w:top w:w="70" w:type="dxa"/>
+              <w:bottom w:w="70" w:type="dxa"/>
+              <w:left w:w="100" w:type="dxa"/>
+              <w:right w:w="100" w:type="dxa"/>
+            </w:tcMar>
+          </w:tcPr>
+          <w:p>
+            <w:r>
+              <w:rPr>
+                <w:b/>
+                <w:sz w:val="20"/>
+              </w:rPr>
+              <w:t>92.31%</w:t>
+            </w:r>
+          </w:p>
+        </w:tc>
+        <w:tc>
+          <w:tcPr>
+            <w:tcW w:type="dxa" w:w="2412"/>
+            <w:shd w:fill="FFFFFF"/>
+            <w:tcMar>
+              <w:top w:w="70" w:type="dxa"/>
+              <w:bottom w:w="70" w:type="dxa"/>
+              <w:left w:w="100" w:type="dxa"/>
+              <w:right w:w="100" w:type="dxa"/>
+            </w:tcMar>
+          </w:tcPr>
+          <w:p>
+            <w:r>
+              <w:rPr>
+                <w:b/>
+                <w:sz w:val="20"/>
+              </w:rPr>
+              <w:t>95.38%</w:t>
+            </w:r>
+          </w:p>
+        </w:tc>
+        <w:tc>
+          <w:tcPr>
+            <w:tcW w:type="dxa" w:w="2412"/>
+            <w:shd w:fill="FFFFFF"/>
+            <w:tcMar>
+              <w:top w:w="70" w:type="dxa"/>
+              <w:bottom w:w="70" w:type="dxa"/>
+              <w:left w:w="100" w:type="dxa"/>
+              <w:right w:w="100" w:type="dxa"/>
+            </w:tcMar>
+          </w:tcPr>
+          <w:p>
+            <w:r>
+              <w:rPr>
+                <w:b/>
+                <w:sz w:val="20"/>
+              </w:rPr>
+              <w:t>0.9397</w:t>
+            </w:r>
+          </w:p>
+        </w:tc>
+      </w:tr>
+      <w:tr>
+        <w:tc>
+          <w:tcPr>
+            <w:tcW w:type="dxa" w:w="2412"/>
+            <w:shd w:fill="F8FAFC"/>
+            <w:tcMar>
+              <w:top w:w="70" w:type="dxa"/>
+              <w:bottom w:w="70" w:type="dxa"/>
+              <w:left w:w="100" w:type="dxa"/>
+              <w:right w:w="100" w:type="dxa"/>
+            </w:tcMar>
+          </w:tcPr>
+          <w:p>
+            <w:r>
+              <w:rPr>
+                <w:sz w:val="20"/>
+              </w:rPr>
+              <w:t>E5 Không tiền tố (No-prefix)</w:t>
+            </w:r>
+          </w:p>
+        </w:tc>
+        <w:tc>
+          <w:tcPr>
+            <w:tcW w:type="dxa" w:w="2412"/>
             <w:shd w:fill="F8FAFC"/>
             <w:tcMar>
               <w:top w:w="70" w:type="dxa"/>
@@ -2480,13 +1755,13 @@
                 <w:b/>
                 <w:sz w:val="20"/>
               </w:rPr>
-              <w:t>100.0%</w:t>
+              <w:t>93.85%</w:t>
             </w:r>
           </w:p>
         </w:tc>
         <w:tc>
           <w:tcPr>
-            <w:tcW w:type="dxa" w:w="1930"/>
+            <w:tcW w:type="dxa" w:w="2412"/>
             <w:shd w:fill="F8FAFC"/>
             <w:tcMar>
               <w:top w:w="70" w:type="dxa"/>
@@ -2501,7 +1776,28 @@
                 <w:b/>
                 <w:sz w:val="20"/>
               </w:rPr>
-              <w:t>1.000</w:t>
+              <w:t>93.85%</w:t>
+            </w:r>
+          </w:p>
+        </w:tc>
+        <w:tc>
+          <w:tcPr>
+            <w:tcW w:type="dxa" w:w="2412"/>
+            <w:shd w:fill="F8FAFC"/>
+            <w:tcMar>
+              <w:top w:w="70" w:type="dxa"/>
+              <w:bottom w:w="70" w:type="dxa"/>
+              <w:left w:w="100" w:type="dxa"/>
+              <w:right w:w="100" w:type="dxa"/>
+            </w:tcMar>
+          </w:tcPr>
+          <w:p>
+            <w:r>
+              <w:rPr>
+                <w:b/>
+                <w:sz w:val="20"/>
+              </w:rPr>
+              <w:t>0.9454</w:t>
             </w:r>
           </w:p>
         </w:tc>
@@ -2509,7 +1805,7 @@
       <w:tr>
         <w:tc>
           <w:tcPr>
-            <w:tcW w:type="dxa" w:w="1930"/>
+            <w:tcW w:type="dxa" w:w="2412"/>
             <w:shd w:fill="FFFFFF"/>
             <w:tcMar>
               <w:top w:w="70" w:type="dxa"/>
@@ -2523,33 +1819,13 @@
               <w:rPr>
                 <w:sz w:val="20"/>
               </w:rPr>
-              <w:t>Cảnh báo &amp; Xử lý học vụ</w:t>
+              <w:t>Cấu hình Top-K = 2</w:t>
             </w:r>
           </w:p>
         </w:tc>
         <w:tc>
           <w:tcPr>
-            <w:tcW w:type="dxa" w:w="1930"/>
-            <w:shd w:fill="FFFFFF"/>
-            <w:tcMar>
-              <w:top w:w="70" w:type="dxa"/>
-              <w:bottom w:w="70" w:type="dxa"/>
-              <w:left w:w="100" w:type="dxa"/>
-              <w:right w:w="100" w:type="dxa"/>
-            </w:tcMar>
-          </w:tcPr>
-          <w:p>
-            <w:r>
-              <w:rPr>
-                <w:sz w:val="20"/>
-              </w:rPr>
-              <w:t>4</w:t>
-            </w:r>
-          </w:p>
-        </w:tc>
-        <w:tc>
-          <w:tcPr>
-            <w:tcW w:type="dxa" w:w="1930"/>
+            <w:tcW w:type="dxa" w:w="2412"/>
             <w:shd w:fill="FFFFFF"/>
             <w:tcMar>
               <w:top w:w="70" w:type="dxa"/>
@@ -2564,13 +1840,13 @@
                 <w:b/>
                 <w:sz w:val="20"/>
               </w:rPr>
-              <w:t>75.0%</w:t>
+              <w:t>92.31%</w:t>
             </w:r>
           </w:p>
         </w:tc>
         <w:tc>
           <w:tcPr>
-            <w:tcW w:type="dxa" w:w="1930"/>
+            <w:tcW w:type="dxa" w:w="2412"/>
             <w:shd w:fill="FFFFFF"/>
             <w:tcMar>
               <w:top w:w="70" w:type="dxa"/>
@@ -2585,13 +1861,13 @@
                 <w:b/>
                 <w:sz w:val="20"/>
               </w:rPr>
-              <w:t>100.0%</w:t>
+              <w:t>92.31%</w:t>
             </w:r>
           </w:p>
         </w:tc>
         <w:tc>
           <w:tcPr>
-            <w:tcW w:type="dxa" w:w="1930"/>
+            <w:tcW w:type="dxa" w:w="2412"/>
             <w:shd w:fill="FFFFFF"/>
             <w:tcMar>
               <w:top w:w="70" w:type="dxa"/>
@@ -2606,7 +1882,7 @@
                 <w:b/>
                 <w:sz w:val="20"/>
               </w:rPr>
-              <w:t>0.875</w:t>
+              <w:t>0.9397</w:t>
             </w:r>
           </w:p>
         </w:tc>
@@ -2614,7 +1890,7 @@
       <w:tr>
         <w:tc>
           <w:tcPr>
-            <w:tcW w:type="dxa" w:w="1930"/>
+            <w:tcW w:type="dxa" w:w="2412"/>
             <w:shd w:fill="F8FAFC"/>
             <w:tcMar>
               <w:top w:w="70" w:type="dxa"/>
@@ -2628,33 +1904,13 @@
               <w:rPr>
                 <w:sz w:val="20"/>
               </w:rPr>
-              <w:t>Xét &amp; Hạng tốt nghiệp</w:t>
+              <w:t>Cấu hình Top-K = 4 (Mặc định)</w:t>
             </w:r>
           </w:p>
         </w:tc>
         <w:tc>
           <w:tcPr>
-            <w:tcW w:type="dxa" w:w="1930"/>
-            <w:shd w:fill="F8FAFC"/>
-            <w:tcMar>
-              <w:top w:w="70" w:type="dxa"/>
-              <w:bottom w:w="70" w:type="dxa"/>
-              <w:left w:w="100" w:type="dxa"/>
-              <w:right w:w="100" w:type="dxa"/>
-            </w:tcMar>
-          </w:tcPr>
-          <w:p>
-            <w:r>
-              <w:rPr>
-                <w:sz w:val="20"/>
-              </w:rPr>
-              <w:t>3</w:t>
-            </w:r>
-          </w:p>
-        </w:tc>
-        <w:tc>
-          <w:tcPr>
-            <w:tcW w:type="dxa" w:w="1930"/>
+            <w:tcW w:type="dxa" w:w="2412"/>
             <w:shd w:fill="F8FAFC"/>
             <w:tcMar>
               <w:top w:w="70" w:type="dxa"/>
@@ -2669,13 +1925,13 @@
                 <w:b/>
                 <w:sz w:val="20"/>
               </w:rPr>
-              <w:t>100.0%</w:t>
+              <w:t>92.31%</w:t>
             </w:r>
           </w:p>
         </w:tc>
         <w:tc>
           <w:tcPr>
-            <w:tcW w:type="dxa" w:w="1930"/>
+            <w:tcW w:type="dxa" w:w="2412"/>
             <w:shd w:fill="F8FAFC"/>
             <w:tcMar>
               <w:top w:w="70" w:type="dxa"/>
@@ -2690,13 +1946,13 @@
                 <w:b/>
                 <w:sz w:val="20"/>
               </w:rPr>
-              <w:t>100.0%</w:t>
+              <w:t>95.38%</w:t>
             </w:r>
           </w:p>
         </w:tc>
         <w:tc>
           <w:tcPr>
-            <w:tcW w:type="dxa" w:w="1930"/>
+            <w:tcW w:type="dxa" w:w="2412"/>
             <w:shd w:fill="F8FAFC"/>
             <w:tcMar>
               <w:top w:w="70" w:type="dxa"/>
@@ -2711,7 +1967,7 @@
                 <w:b/>
                 <w:sz w:val="20"/>
               </w:rPr>
-              <w:t>1.000</w:t>
+              <w:t>0.9397</w:t>
             </w:r>
           </w:p>
         </w:tc>
@@ -2719,7 +1975,7 @@
       <w:tr>
         <w:tc>
           <w:tcPr>
-            <w:tcW w:type="dxa" w:w="1930"/>
+            <w:tcW w:type="dxa" w:w="2412"/>
             <w:shd w:fill="FFFFFF"/>
             <w:tcMar>
               <w:top w:w="70" w:type="dxa"/>
@@ -2733,33 +1989,13 @@
               <w:rPr>
                 <w:sz w:val="20"/>
               </w:rPr>
-              <w:t>Bảo lưu &amp; Kỷ luật thi</w:t>
+              <w:t>Cấu hình Top-K = 6</w:t>
             </w:r>
           </w:p>
         </w:tc>
         <w:tc>
           <w:tcPr>
-            <w:tcW w:type="dxa" w:w="1930"/>
-            <w:shd w:fill="FFFFFF"/>
-            <w:tcMar>
-              <w:top w:w="70" w:type="dxa"/>
-              <w:bottom w:w="70" w:type="dxa"/>
-              <w:left w:w="100" w:type="dxa"/>
-              <w:right w:w="100" w:type="dxa"/>
-            </w:tcMar>
-          </w:tcPr>
-          <w:p>
-            <w:r>
-              <w:rPr>
-                <w:sz w:val="20"/>
-              </w:rPr>
-              <w:t>3</w:t>
-            </w:r>
-          </w:p>
-        </w:tc>
-        <w:tc>
-          <w:tcPr>
-            <w:tcW w:type="dxa" w:w="1930"/>
+            <w:tcW w:type="dxa" w:w="2412"/>
             <w:shd w:fill="FFFFFF"/>
             <w:tcMar>
               <w:top w:w="70" w:type="dxa"/>
@@ -2774,13 +2010,13 @@
                 <w:b/>
                 <w:sz w:val="20"/>
               </w:rPr>
-              <w:t>100.0%</w:t>
+              <w:t>92.31%</w:t>
             </w:r>
           </w:p>
         </w:tc>
         <w:tc>
           <w:tcPr>
-            <w:tcW w:type="dxa" w:w="1930"/>
+            <w:tcW w:type="dxa" w:w="2412"/>
             <w:shd w:fill="FFFFFF"/>
             <w:tcMar>
               <w:top w:w="70" w:type="dxa"/>
@@ -2795,13 +2031,13 @@
                 <w:b/>
                 <w:sz w:val="20"/>
               </w:rPr>
-              <w:t>100.0%</w:t>
+              <w:t>95.38%</w:t>
             </w:r>
           </w:p>
         </w:tc>
         <w:tc>
           <w:tcPr>
-            <w:tcW w:type="dxa" w:w="1930"/>
+            <w:tcW w:type="dxa" w:w="2412"/>
             <w:shd w:fill="FFFFFF"/>
             <w:tcMar>
               <w:top w:w="70" w:type="dxa"/>
@@ -2816,35 +2052,582 @@
                 <w:b/>
                 <w:sz w:val="20"/>
               </w:rPr>
-              <w:t>1.000</w:t>
+              <w:t>0.9397</w:t>
             </w:r>
           </w:p>
         </w:tc>
       </w:tr>
     </w:tbl>
     <w:p>
+      <w:r>
+        <w:t>Nhận xét thực nghiệm:</w:t>
+        <w:br/>
+        <w:t>• Khi tăng Top-K từ 2 lên 4, độ bao phủ tri thức đúng tăng từ 92.31% lên 95.38%.</w:t>
+        <w:br/>
+        <w:t>• Khi tiếp tục tăng lên Top-K = 6, độ chính xác không tăng thêm (vẫn 95.38%) nhưng lại làm tăng kích thước prompt gửi vào LLM thêm 50%, chứng minh rằng cấu hình Top-K = 4 là điểm cân bằng tối ưu nhất (optimal sweet spot) giữa độ bao phủ tri thức và độ trễ.</w:t>
+      </w:r>
+    </w:p>
+    <w:p>
       <w:pPr>
         <w:spacing w:before="160"/>
       </w:pPr>
+      <w:r>
+        <w:rPr>
+          <w:b/>
+          <w:sz w:val="24"/>
+        </w:rPr>
+        <w:t>4.3. Thực nghiệm 3: Đo lường Độ trễ Hệ thống Thực tế (Latency: Min, Median, P95, Max)</w:t>
+      </w:r>
+    </w:p>
+    <w:p>
+      <w:r>
+        <w:t>Đo đạc thời gian xử lý thực tế qua 30 lần lặp liên tiếp trên các câu hỏi kiểm thử:</w:t>
+      </w:r>
     </w:p>
     <w:p>
       <w:r>
         <w:rPr>
           <w:b/>
+          <w:sz w:val="22"/>
+        </w:rPr>
+        <w:t>Bảng 4.3: Thống kê độ trễ các giai đoạn xử lý truy xuất (Đơn vị: mili-giây ms)</w:t>
+      </w:r>
+    </w:p>
+    <w:tbl>
+      <w:tblPr>
+        <w:tblW w:type="auto" w:w="0"/>
+        <w:jc w:val="center"/>
+        <w:tblLook w:firstColumn="1" w:firstRow="1" w:lastColumn="0" w:lastRow="0" w:noHBand="0" w:noVBand="1" w:val="04A0"/>
+      </w:tblPr>
+      <w:tblGrid>
+        <w:gridCol w:w="1608"/>
+        <w:gridCol w:w="1608"/>
+        <w:gridCol w:w="1608"/>
+        <w:gridCol w:w="1608"/>
+        <w:gridCol w:w="1608"/>
+        <w:gridCol w:w="1608"/>
+      </w:tblGrid>
+      <w:tr>
+        <w:tc>
+          <w:tcPr>
+            <w:tcW w:type="dxa" w:w="1608"/>
+            <w:shd w:fill="E2E8F0"/>
+            <w:tcMar>
+              <w:top w:w="80" w:type="dxa"/>
+              <w:bottom w:w="80" w:type="dxa"/>
+              <w:left w:w="100" w:type="dxa"/>
+              <w:right w:w="100" w:type="dxa"/>
+            </w:tcMar>
+          </w:tcPr>
+          <w:p>
+            <w:r>
+              <w:rPr>
+                <w:b/>
+              </w:rPr>
+              <w:t>Giai đoạn xử lý</w:t>
+            </w:r>
+          </w:p>
+        </w:tc>
+        <w:tc>
+          <w:tcPr>
+            <w:tcW w:type="dxa" w:w="1608"/>
+            <w:shd w:fill="E2E8F0"/>
+            <w:tcMar>
+              <w:top w:w="80" w:type="dxa"/>
+              <w:bottom w:w="80" w:type="dxa"/>
+              <w:left w:w="100" w:type="dxa"/>
+              <w:right w:w="100" w:type="dxa"/>
+            </w:tcMar>
+          </w:tcPr>
+          <w:p>
+            <w:r>
+              <w:rPr>
+                <w:b/>
+              </w:rPr>
+              <w:t>Min (ms)</w:t>
+            </w:r>
+          </w:p>
+        </w:tc>
+        <w:tc>
+          <w:tcPr>
+            <w:tcW w:type="dxa" w:w="1608"/>
+            <w:shd w:fill="E2E8F0"/>
+            <w:tcMar>
+              <w:top w:w="80" w:type="dxa"/>
+              <w:bottom w:w="80" w:type="dxa"/>
+              <w:left w:w="100" w:type="dxa"/>
+              <w:right w:w="100" w:type="dxa"/>
+            </w:tcMar>
+          </w:tcPr>
+          <w:p>
+            <w:r>
+              <w:rPr>
+                <w:b/>
+              </w:rPr>
+              <w:t>Median (ms)</w:t>
+            </w:r>
+          </w:p>
+        </w:tc>
+        <w:tc>
+          <w:tcPr>
+            <w:tcW w:type="dxa" w:w="1608"/>
+            <w:shd w:fill="E2E8F0"/>
+            <w:tcMar>
+              <w:top w:w="80" w:type="dxa"/>
+              <w:bottom w:w="80" w:type="dxa"/>
+              <w:left w:w="100" w:type="dxa"/>
+              <w:right w:w="100" w:type="dxa"/>
+            </w:tcMar>
+          </w:tcPr>
+          <w:p>
+            <w:r>
+              <w:rPr>
+                <w:b/>
+              </w:rPr>
+              <w:t>P95 (ms)</w:t>
+            </w:r>
+          </w:p>
+        </w:tc>
+        <w:tc>
+          <w:tcPr>
+            <w:tcW w:type="dxa" w:w="1608"/>
+            <w:shd w:fill="E2E8F0"/>
+            <w:tcMar>
+              <w:top w:w="80" w:type="dxa"/>
+              <w:bottom w:w="80" w:type="dxa"/>
+              <w:left w:w="100" w:type="dxa"/>
+              <w:right w:w="100" w:type="dxa"/>
+            </w:tcMar>
+          </w:tcPr>
+          <w:p>
+            <w:r>
+              <w:rPr>
+                <w:b/>
+              </w:rPr>
+              <w:t>Max (ms)</w:t>
+            </w:r>
+          </w:p>
+        </w:tc>
+        <w:tc>
+          <w:tcPr>
+            <w:tcW w:type="dxa" w:w="1608"/>
+            <w:shd w:fill="E2E8F0"/>
+            <w:tcMar>
+              <w:top w:w="80" w:type="dxa"/>
+              <w:bottom w:w="80" w:type="dxa"/>
+              <w:left w:w="100" w:type="dxa"/>
+              <w:right w:w="100" w:type="dxa"/>
+            </w:tcMar>
+          </w:tcPr>
+          <w:p>
+            <w:r>
+              <w:rPr>
+                <w:b/>
+              </w:rPr>
+              <w:t>Mean (ms)</w:t>
+            </w:r>
+          </w:p>
+        </w:tc>
+      </w:tr>
+      <w:tr>
+        <w:tc>
+          <w:tcPr>
+            <w:tcW w:type="dxa" w:w="1608"/>
+            <w:shd w:fill="FFFFFF"/>
+            <w:tcMar>
+              <w:top w:w="70" w:type="dxa"/>
+              <w:bottom w:w="70" w:type="dxa"/>
+              <w:left w:w="100" w:type="dxa"/>
+              <w:right w:w="100" w:type="dxa"/>
+            </w:tcMar>
+          </w:tcPr>
+          <w:p>
+            <w:r>
+              <w:rPr>
+                <w:sz w:val="20"/>
+              </w:rPr>
+              <w:t>Mã hóa véc-tơ E5 (CPU)</w:t>
+            </w:r>
+          </w:p>
+        </w:tc>
+        <w:tc>
+          <w:tcPr>
+            <w:tcW w:type="dxa" w:w="1608"/>
+            <w:shd w:fill="FFFFFF"/>
+            <w:tcMar>
+              <w:top w:w="70" w:type="dxa"/>
+              <w:bottom w:w="70" w:type="dxa"/>
+              <w:left w:w="100" w:type="dxa"/>
+              <w:right w:w="100" w:type="dxa"/>
+            </w:tcMar>
+          </w:tcPr>
+          <w:p>
+            <w:r>
+              <w:rPr>
+                <w:sz w:val="20"/>
+              </w:rPr>
+              <w:t>35.79</w:t>
+            </w:r>
+          </w:p>
+        </w:tc>
+        <w:tc>
+          <w:tcPr>
+            <w:tcW w:type="dxa" w:w="1608"/>
+            <w:shd w:fill="FFFFFF"/>
+            <w:tcMar>
+              <w:top w:w="70" w:type="dxa"/>
+              <w:bottom w:w="70" w:type="dxa"/>
+              <w:left w:w="100" w:type="dxa"/>
+              <w:right w:w="100" w:type="dxa"/>
+            </w:tcMar>
+          </w:tcPr>
+          <w:p>
+            <w:r>
+              <w:rPr>
+                <w:b/>
+                <w:color w:val="4F46E5"/>
+                <w:sz w:val="20"/>
+              </w:rPr>
+              <w:t>48.96</w:t>
+            </w:r>
+          </w:p>
+        </w:tc>
+        <w:tc>
+          <w:tcPr>
+            <w:tcW w:type="dxa" w:w="1608"/>
+            <w:shd w:fill="FFFFFF"/>
+            <w:tcMar>
+              <w:top w:w="70" w:type="dxa"/>
+              <w:bottom w:w="70" w:type="dxa"/>
+              <w:left w:w="100" w:type="dxa"/>
+              <w:right w:w="100" w:type="dxa"/>
+            </w:tcMar>
+          </w:tcPr>
+          <w:p>
+            <w:r>
+              <w:rPr>
+                <w:b/>
+                <w:color w:val="4F46E5"/>
+                <w:sz w:val="20"/>
+              </w:rPr>
+              <w:t>63.56</w:t>
+            </w:r>
+          </w:p>
+        </w:tc>
+        <w:tc>
+          <w:tcPr>
+            <w:tcW w:type="dxa" w:w="1608"/>
+            <w:shd w:fill="FFFFFF"/>
+            <w:tcMar>
+              <w:top w:w="70" w:type="dxa"/>
+              <w:bottom w:w="70" w:type="dxa"/>
+              <w:left w:w="100" w:type="dxa"/>
+              <w:right w:w="100" w:type="dxa"/>
+            </w:tcMar>
+          </w:tcPr>
+          <w:p>
+            <w:r>
+              <w:rPr>
+                <w:sz w:val="20"/>
+              </w:rPr>
+              <w:t>66.84</w:t>
+            </w:r>
+          </w:p>
+        </w:tc>
+        <w:tc>
+          <w:tcPr>
+            <w:tcW w:type="dxa" w:w="1608"/>
+            <w:shd w:fill="FFFFFF"/>
+            <w:tcMar>
+              <w:top w:w="70" w:type="dxa"/>
+              <w:bottom w:w="70" w:type="dxa"/>
+              <w:left w:w="100" w:type="dxa"/>
+              <w:right w:w="100" w:type="dxa"/>
+            </w:tcMar>
+          </w:tcPr>
+          <w:p>
+            <w:r>
+              <w:rPr>
+                <w:sz w:val="20"/>
+              </w:rPr>
+              <w:t>48.60</w:t>
+            </w:r>
+          </w:p>
+        </w:tc>
+      </w:tr>
+      <w:tr>
+        <w:tc>
+          <w:tcPr>
+            <w:tcW w:type="dxa" w:w="1608"/>
+            <w:shd w:fill="F8FAFC"/>
+            <w:tcMar>
+              <w:top w:w="70" w:type="dxa"/>
+              <w:bottom w:w="70" w:type="dxa"/>
+              <w:left w:w="100" w:type="dxa"/>
+              <w:right w:w="100" w:type="dxa"/>
+            </w:tcMar>
+          </w:tcPr>
+          <w:p>
+            <w:r>
+              <w:rPr>
+                <w:sz w:val="20"/>
+              </w:rPr>
+              <w:t>Truy vấn ChromaDB</w:t>
+            </w:r>
+          </w:p>
+        </w:tc>
+        <w:tc>
+          <w:tcPr>
+            <w:tcW w:type="dxa" w:w="1608"/>
+            <w:shd w:fill="F8FAFC"/>
+            <w:tcMar>
+              <w:top w:w="70" w:type="dxa"/>
+              <w:bottom w:w="70" w:type="dxa"/>
+              <w:left w:w="100" w:type="dxa"/>
+              <w:right w:w="100" w:type="dxa"/>
+            </w:tcMar>
+          </w:tcPr>
+          <w:p>
+            <w:r>
+              <w:rPr>
+                <w:sz w:val="20"/>
+              </w:rPr>
+              <w:t>3.05</w:t>
+            </w:r>
+          </w:p>
+        </w:tc>
+        <w:tc>
+          <w:tcPr>
+            <w:tcW w:type="dxa" w:w="1608"/>
+            <w:shd w:fill="F8FAFC"/>
+            <w:tcMar>
+              <w:top w:w="70" w:type="dxa"/>
+              <w:bottom w:w="70" w:type="dxa"/>
+              <w:left w:w="100" w:type="dxa"/>
+              <w:right w:w="100" w:type="dxa"/>
+            </w:tcMar>
+          </w:tcPr>
+          <w:p>
+            <w:r>
+              <w:rPr>
+                <w:b/>
+                <w:color w:val="4F46E5"/>
+                <w:sz w:val="20"/>
+              </w:rPr>
+              <w:t>3.62</w:t>
+            </w:r>
+          </w:p>
+        </w:tc>
+        <w:tc>
+          <w:tcPr>
+            <w:tcW w:type="dxa" w:w="1608"/>
+            <w:shd w:fill="F8FAFC"/>
+            <w:tcMar>
+              <w:top w:w="70" w:type="dxa"/>
+              <w:bottom w:w="70" w:type="dxa"/>
+              <w:left w:w="100" w:type="dxa"/>
+              <w:right w:w="100" w:type="dxa"/>
+            </w:tcMar>
+          </w:tcPr>
+          <w:p>
+            <w:r>
+              <w:rPr>
+                <w:b/>
+                <w:color w:val="4F46E5"/>
+                <w:sz w:val="20"/>
+              </w:rPr>
+              <w:t>4.83</w:t>
+            </w:r>
+          </w:p>
+        </w:tc>
+        <w:tc>
+          <w:tcPr>
+            <w:tcW w:type="dxa" w:w="1608"/>
+            <w:shd w:fill="F8FAFC"/>
+            <w:tcMar>
+              <w:top w:w="70" w:type="dxa"/>
+              <w:bottom w:w="70" w:type="dxa"/>
+              <w:left w:w="100" w:type="dxa"/>
+              <w:right w:w="100" w:type="dxa"/>
+            </w:tcMar>
+          </w:tcPr>
+          <w:p>
+            <w:r>
+              <w:rPr>
+                <w:sz w:val="20"/>
+              </w:rPr>
+              <w:t>4.86</w:t>
+            </w:r>
+          </w:p>
+        </w:tc>
+        <w:tc>
+          <w:tcPr>
+            <w:tcW w:type="dxa" w:w="1608"/>
+            <w:shd w:fill="F8FAFC"/>
+            <w:tcMar>
+              <w:top w:w="70" w:type="dxa"/>
+              <w:bottom w:w="70" w:type="dxa"/>
+              <w:left w:w="100" w:type="dxa"/>
+              <w:right w:w="100" w:type="dxa"/>
+            </w:tcMar>
+          </w:tcPr>
+          <w:p>
+            <w:r>
+              <w:rPr>
+                <w:sz w:val="20"/>
+              </w:rPr>
+              <w:t>3.68</w:t>
+            </w:r>
+          </w:p>
+        </w:tc>
+      </w:tr>
+      <w:tr>
+        <w:tc>
+          <w:tcPr>
+            <w:tcW w:type="dxa" w:w="1608"/>
+            <w:shd w:fill="FFFFFF"/>
+            <w:tcMar>
+              <w:top w:w="70" w:type="dxa"/>
+              <w:bottom w:w="70" w:type="dxa"/>
+              <w:left w:w="100" w:type="dxa"/>
+              <w:right w:w="100" w:type="dxa"/>
+            </w:tcMar>
+          </w:tcPr>
+          <w:p>
+            <w:r>
+              <w:rPr>
+                <w:sz w:val="20"/>
+              </w:rPr>
+              <w:t>Tổng thời gian truy xuất RAG</w:t>
+            </w:r>
+          </w:p>
+        </w:tc>
+        <w:tc>
+          <w:tcPr>
+            <w:tcW w:type="dxa" w:w="1608"/>
+            <w:shd w:fill="FFFFFF"/>
+            <w:tcMar>
+              <w:top w:w="70" w:type="dxa"/>
+              <w:bottom w:w="70" w:type="dxa"/>
+              <w:left w:w="100" w:type="dxa"/>
+              <w:right w:w="100" w:type="dxa"/>
+            </w:tcMar>
+          </w:tcPr>
+          <w:p>
+            <w:r>
+              <w:rPr>
+                <w:sz w:val="20"/>
+              </w:rPr>
+              <w:t>39.57</w:t>
+            </w:r>
+          </w:p>
+        </w:tc>
+        <w:tc>
+          <w:tcPr>
+            <w:tcW w:type="dxa" w:w="1608"/>
+            <w:shd w:fill="FFFFFF"/>
+            <w:tcMar>
+              <w:top w:w="70" w:type="dxa"/>
+              <w:bottom w:w="70" w:type="dxa"/>
+              <w:left w:w="100" w:type="dxa"/>
+              <w:right w:w="100" w:type="dxa"/>
+            </w:tcMar>
+          </w:tcPr>
+          <w:p>
+            <w:r>
+              <w:rPr>
+                <w:b/>
+                <w:color w:val="4F46E5"/>
+                <w:sz w:val="20"/>
+              </w:rPr>
+              <w:t>53.38</w:t>
+            </w:r>
+          </w:p>
+        </w:tc>
+        <w:tc>
+          <w:tcPr>
+            <w:tcW w:type="dxa" w:w="1608"/>
+            <w:shd w:fill="FFFFFF"/>
+            <w:tcMar>
+              <w:top w:w="70" w:type="dxa"/>
+              <w:bottom w:w="70" w:type="dxa"/>
+              <w:left w:w="100" w:type="dxa"/>
+              <w:right w:w="100" w:type="dxa"/>
+            </w:tcMar>
+          </w:tcPr>
+          <w:p>
+            <w:r>
+              <w:rPr>
+                <w:b/>
+                <w:color w:val="4F46E5"/>
+                <w:sz w:val="20"/>
+              </w:rPr>
+              <w:t>68.39</w:t>
+            </w:r>
+          </w:p>
+        </w:tc>
+        <w:tc>
+          <w:tcPr>
+            <w:tcW w:type="dxa" w:w="1608"/>
+            <w:shd w:fill="FFFFFF"/>
+            <w:tcMar>
+              <w:top w:w="70" w:type="dxa"/>
+              <w:bottom w:w="70" w:type="dxa"/>
+              <w:left w:w="100" w:type="dxa"/>
+              <w:right w:w="100" w:type="dxa"/>
+            </w:tcMar>
+          </w:tcPr>
+          <w:p>
+            <w:r>
+              <w:rPr>
+                <w:sz w:val="20"/>
+              </w:rPr>
+              <w:t>71.14</w:t>
+            </w:r>
+          </w:p>
+        </w:tc>
+        <w:tc>
+          <w:tcPr>
+            <w:tcW w:type="dxa" w:w="1608"/>
+            <w:shd w:fill="FFFFFF"/>
+            <w:tcMar>
+              <w:top w:w="70" w:type="dxa"/>
+              <w:bottom w:w="70" w:type="dxa"/>
+              <w:left w:w="100" w:type="dxa"/>
+              <w:right w:w="100" w:type="dxa"/>
+            </w:tcMar>
+          </w:tcPr>
+          <w:p>
+            <w:r>
+              <w:rPr>
+                <w:sz w:val="20"/>
+              </w:rPr>
+              <w:t>52.29</w:t>
+            </w:r>
+          </w:p>
+        </w:tc>
+      </w:tr>
+    </w:tbl>
+    <w:p>
+      <w:r>
+        <w:t>Đánh giá hiệu năng: Tổng thời gian truy xuất RAG có giá trị trung vị (Median) là 53.38 ms và bách phân vị thứ 95 (P95) chỉ đạt 68.39 ms (dưới 70 ms cho 95% các truy vấn). Toàn bộ quá trình tạo sinh SSE có Time-to-First-Token (TTFT) trung bình từ 550 - 750 ms, đáp ứng hoàn toàn tiêu chuẩn phản hồi thời gian thực của các ứng dụng web học vụ.</w:t>
+      </w:r>
+    </w:p>
+    <w:p>
+      <w:pPr>
+        <w:spacing w:before="160"/>
+      </w:pPr>
+      <w:r>
+        <w:rPr>
+          <w:b/>
           <w:sz w:val="24"/>
         </w:rPr>
-        <w:t>4.5. Phân tích Hiện tượng Tương đồng Đa nguồn (Multi-Source Case Study)</w:t>
+        <w:t>4.4. Thực nghiệm 4: Đánh giá Câu hỏi Ngoài phạm vi và Khả năng Chống Ảo giác</w:t>
       </w:r>
     </w:p>
     <w:p>
       <w:r>
-        <w:t>Kết quả thực nghiệm cho thấy một hiện tượng nghiên cứu rất thú vị tại câu hỏi TC19: 'Sinh viên bị buộc thôi học có được bảo lưu kết quả học tập đã hoàn thành không?'.</w:t>
-        <w:br/>
-        <w:t>• Kết quả Top-1 trả về: Điều 14 (Bảo lưu và nghỉ học tạm thời, điểm tương đồng 0.892).</w:t>
-        <w:br/>
-        <w:t>• Kết quả Top-2 trả về: Điều 11 (Cảnh báo học vụ và buộc thôi học, điểm tương đồng 0.887).</w:t>
-        <w:br/>
-        <w:t>Phân tích chuyên sâu: Cả hai Điều luật đều trực tiếp quy định về từ khóa 'bảo lưu'. Trong đó Điều 11 Khoản 3 nêu rõ: 'Sinh viên bị buộc thôi học được quyền xin bảo lưu kết quả học tập đã tích lũy...', còn Điều 14 quy định thủ tục bảo lưu chung. Do hệ thống cấu hình `top_k=4` (lấy 4 chunk liên quan nhất), cả hai Điều 11 và Điều 14 đều được đưa đồng thời vào ngữ cảnh của LLM. Nhờ đó, câu trả lời sinh ra vẫn hoàn toàn chính xác 100%. Đây là minh chứng rõ ràng cho thấy cấu hình Top-K=4 trong kiến trúc RAG giúp bù đắp hoàn hảo tính đa nghĩa của ngôn ngữ tự nhiên mà tra cứu từ khóa đơn lẻ không làm được.</w:t>
+        <w:t>Đối với 10 câu hỏi ngoài phạm vi quy chế (như học phí ngành Y, quy chế thạc sĩ, vé xe bus, ký túc xá...), điểm tương đồng Cosine trung bình cao nhất chỉ đạt 0.834 (thấp hơn rõ rệt so với mức 0.890 - 0.930 của câu hỏi đúng phạm vi). Nhờ System Prompt quy định chặt chẽ quy tắc số 4 ('Nếu ngữ cảnh không có thông tin, hãy từ chối và hướng dẫn liên hệ Phòng Đào tạo'), hệ thống đạt tỷ lệ từ chối trả lời chính xác 10/10 câu hỏi (100%), không có hiện tượng bịa đặt số liệu hay tự suy diễn quy định ngoài tài liệu.</w:t>
       </w:r>
     </w:p>
     <w:p>
@@ -2862,29 +2645,31 @@
           <w:color w:val="1E293B"/>
           <w:sz w:val="27"/>
         </w:rPr>
-        <w:t>PHẦN 5: KẾT LUẬN VÀ GIÁ TRỊ THỰC TIỄN CỦA ĐỒ ÁN</w:t>
+        <w:t>PHẦN 5: KẾT LUẬN VÀ HƯỚNG PHÁT TRIỂN</w:t>
       </w:r>
     </w:p>
     <w:p>
       <w:r>
-        <w:t>1. Đóng góp cốt lõi của đề tài:</w:t>
+        <w:t>1. Đóng góp cốt lõi của đồ án:</w:t>
         <w:br/>
-        <w:t>• Xây dựng thành công hệ thống RAG chuyên biệt cho bài toán Quy chế đào tạo đại học, đạt độ chính xác trích xuất Top-3 100% và MRR 0.980.</w:t>
+        <w:t>• Hiện thực hóa thành công hệ thống Trợ lý RAG Học vụ hoàn chỉnh từ khâu tiền xử lý, véc-tơ hóa, lưu trữ, truy xuất đến giao diện tương tác người dùng.</w:t>
         <w:br/>
-        <w:t>• Đổi mới phương pháp khi kết hợp Mô hình ngôn ngữ lớn (LLM) với Bộ quy tắc tất định (Academic Rule Engine), loại bỏ triệt để hiện tượng ảo giác số học.</w:t>
+        <w:t>• Kết hợp thành công giữa Trí tuệ Nhân tạo tạo sinh (LLM) và Bộ quy chế tất định (Academic Rule Engine), giải quyết triệt để bài toán ảo giác số học trong tính điểm GPA và cảnh báo học vụ.</w:t>
         <w:br/>
-        <w:t>• Hệ thống vận hành mượt mà với độ trễ thấp (&lt; 90ms cho bước truy xuất), giao diện web hiện đại hỗ trợ phát dòng thời gian thực qua SSE.</w:t>
+        <w:t>• Có bộ dữ liệu kiểm định 75 câu hỏi và các kết quả thực nghiệm định lượng rõ ràng, minh bạch (Hit@1 &gt; 92%, Hit@3 &gt; 95%, MRR = 0.9397, Latency P95 &lt; 70ms).</w:t>
+        <w:br/>
+        <w:t>• Giao diện người dùng hiện đại, đồng bộ 4 cấp độ rủi ro, hỗ trợ Server-Sent Events mượt mà.</w:t>
       </w:r>
     </w:p>
     <w:p>
       <w:r>
-        <w:t>2. Hướng phát triển trong tương lai:</w:t>
+        <w:t>2. Hướng phát triển tiếp theo:</w:t>
         <w:br/>
-        <w:t>• Triển khai Tìm kiếm lai (Hybrid Search) kết hợp thuật toán BM25 và Vector Embedding để tối ưu hơn nữa các mã môn học viết tắt.</w:t>
+        <w:t>• Xây dựng cơ chế Tìm kiếm lai (Hybrid Search: kết hợp BM25 và Dense Vector bằng thuật toán RRF - Reciprocal Rank Fusion) để phát huy đồng thời ưu điểm của cả hai phương pháp.</w:t>
         <w:br/>
-        <w:t>• Mở rộng kết nối API với Cổng thông tin đào tạo của Nhà trường để tự động đọc bảng điểm thực tế của sinh viên khi đăng nhập.</w:t>
+        <w:t>• Mở rộng tập quy chế thật của nhà trường với quy mô lớn hơn (&gt; 100 trang) và tích hợp tra cứu phân cấp đa tài liệu.</w:t>
         <w:br/>
-        <w:t>• Triển khai trợ lý hỏi đáp đa kênh qua Telegram Bot và Zalo Official Account phục vụ sinh viên mọi lúc mọi nơi.</w:t>
+        <w:t>• Kết nối API xác thực sinh viên (SSO) để cá nhân hóa hoàn toàn lộ trình học vụ.</w:t>
       </w:r>
     </w:p>
     <w:sectPr>

</xml_diff>